<commit_message>
Testing manual 1.2 and column reference 1.2: multi-company payroll
Testing manual: new Phase 10 (employers and their accounts, generating per
company, Bank File / Paid From, remittances / 2316 / 13th month per
company, employer share hidden from employees, cancelling an approved
filing as its owner); 8.9 adding refused once paid; adding only before the
pay date (8.3, 9.5, 9.7); Retro → Payroll Adjustments; Appendix C rules
and the bank upload limit.

Column reference: Payroll Runs Company and Paid From columns; register
Excel Credited To / Paid From; payroll adjustment lines; employer share on
employees' payslips only when shown; the paying account per company; pay
sheet / remittances / year-end tax by the payslip's company; 13th month per
company; Payroll Adjustments (Holiday Pay (manual)).

Table of contents refreshed and PDFs exported with Word.

Co-Authored-By: Claude Opus 5.5 <noreply@anthropic.com>
</commit_message>
<xml_diff>
--- a/test-scenarios/payroll-column-reference.docx
+++ b/test-scenarios/payroll-column-reference.docx
@@ -180,7 +180,7 @@
                 <w:sz w:val="19"/>
                 <w:szCs w:val="19"/>
               </w:rPr>
-              <w:t>1.1 — 10/11/2026 (approval rounds added)</w:t>
+              <w:t>1.2 — 10/14/2026 (multi-company payroll, employer accounts, Paid From, employer share on payslips)</w:t>
             </w:r>
           </w:p>
         </w:tc>
@@ -360,14 +360,7 @@
                 <w:sz w:val="19"/>
                 <w:szCs w:val="19"/>
               </w:rPr>
-              <w:t>Payroll Process — End-to-End Testing Manual (test-scenari</w:t>
-            </w:r>
-            <w:r>
-              <w:rPr>
-                <w:sz w:val="19"/>
-                <w:szCs w:val="19"/>
-              </w:rPr>
-              <w:t>os/payroll-process-testing-manual.docx)</w:t>
+              <w:t>Payroll Process — End-to-End Testing Manual (test-scenarios/payroll-process-testing-manual.docx)</w:t>
             </w:r>
           </w:p>
         </w:tc>
@@ -477,7 +470,7 @@
           <w:r>
             <w:fldChar w:fldCharType="separate"/>
           </w:r>
-          <w:hyperlink w:anchor="_Toc242606769" w:history="1">
+          <w:hyperlink w:anchor="_Toc242887506" w:history="1">
             <w:r>
               <w:rPr>
                 <w:rStyle w:val="Hyperlink"/>
@@ -501,7 +494,7 @@
               <w:rPr>
                 <w:noProof/>
               </w:rPr>
-              <w:instrText xml:space="preserve"> PAGEREF _Toc242606769 \h </w:instrText>
+              <w:instrText xml:space="preserve"> PAGEREF _Toc242887506 \h </w:instrText>
             </w:r>
             <w:r>
               <w:rPr>
@@ -541,7 +534,7 @@
               <w:szCs w:val="22"/>
             </w:rPr>
           </w:pPr>
-          <w:hyperlink w:anchor="_Toc242606770" w:history="1">
+          <w:hyperlink w:anchor="_Toc242887507" w:history="1">
             <w:r>
               <w:rPr>
                 <w:rStyle w:val="Hyperlink"/>
@@ -565,7 +558,7 @@
               <w:rPr>
                 <w:noProof/>
               </w:rPr>
-              <w:instrText xml:space="preserve"> PAGEREF _Toc242606770 \h </w:instrText>
+              <w:instrText xml:space="preserve"> PAGEREF _Toc242887507 \h </w:instrText>
             </w:r>
             <w:r>
               <w:rPr>
@@ -605,7 +598,7 @@
               <w:szCs w:val="22"/>
             </w:rPr>
           </w:pPr>
-          <w:hyperlink w:anchor="_Toc242606771" w:history="1">
+          <w:hyperlink w:anchor="_Toc242887508" w:history="1">
             <w:r>
               <w:rPr>
                 <w:rStyle w:val="Hyperlink"/>
@@ -629,7 +622,7 @@
               <w:rPr>
                 <w:noProof/>
               </w:rPr>
-              <w:instrText xml:space="preserve"> PAGEREF _Toc242606771 \h </w:instrText>
+              <w:instrText xml:space="preserve"> PAGEREF _Toc242887508 \h </w:instrText>
             </w:r>
             <w:r>
               <w:rPr>
@@ -669,7 +662,7 @@
               <w:szCs w:val="22"/>
             </w:rPr>
           </w:pPr>
-          <w:hyperlink w:anchor="_Toc242606772" w:history="1">
+          <w:hyperlink w:anchor="_Toc242887509" w:history="1">
             <w:r>
               <w:rPr>
                 <w:rStyle w:val="Hyperlink"/>
@@ -693,7 +686,7 @@
               <w:rPr>
                 <w:noProof/>
               </w:rPr>
-              <w:instrText xml:space="preserve"> PAGEREF _Toc242606772 \h </w:instrText>
+              <w:instrText xml:space="preserve"> PAGEREF _Toc242887509 \h </w:instrText>
             </w:r>
             <w:r>
               <w:rPr>
@@ -733,7 +726,7 @@
               <w:szCs w:val="22"/>
             </w:rPr>
           </w:pPr>
-          <w:hyperlink w:anchor="_Toc242606773" w:history="1">
+          <w:hyperlink w:anchor="_Toc242887510" w:history="1">
             <w:r>
               <w:rPr>
                 <w:rStyle w:val="Hyperlink"/>
@@ -757,7 +750,7 @@
               <w:rPr>
                 <w:noProof/>
               </w:rPr>
-              <w:instrText xml:space="preserve"> PAGEREF _Toc242606773 \h </w:instrText>
+              <w:instrText xml:space="preserve"> PAGEREF _Toc242887510 \h </w:instrText>
             </w:r>
             <w:r>
               <w:rPr>
@@ -797,7 +790,7 @@
               <w:szCs w:val="22"/>
             </w:rPr>
           </w:pPr>
-          <w:hyperlink w:anchor="_Toc242606774" w:history="1">
+          <w:hyperlink w:anchor="_Toc242887511" w:history="1">
             <w:r>
               <w:rPr>
                 <w:rStyle w:val="Hyperlink"/>
@@ -821,7 +814,7 @@
               <w:rPr>
                 <w:noProof/>
               </w:rPr>
-              <w:instrText xml:space="preserve"> PAGEREF _Toc242606774 \h </w:instrText>
+              <w:instrText xml:space="preserve"> PAGEREF _Toc242887511 \h </w:instrText>
             </w:r>
             <w:r>
               <w:rPr>
@@ -861,7 +854,7 @@
               <w:szCs w:val="22"/>
             </w:rPr>
           </w:pPr>
-          <w:hyperlink w:anchor="_Toc242606775" w:history="1">
+          <w:hyperlink w:anchor="_Toc242887512" w:history="1">
             <w:r>
               <w:rPr>
                 <w:rStyle w:val="Hyperlink"/>
@@ -885,7 +878,7 @@
               <w:rPr>
                 <w:noProof/>
               </w:rPr>
-              <w:instrText xml:space="preserve"> PAGEREF _Toc242606775 \h </w:instrText>
+              <w:instrText xml:space="preserve"> PAGEREF _Toc242887512 \h </w:instrText>
             </w:r>
             <w:r>
               <w:rPr>
@@ -925,7 +918,7 @@
               <w:szCs w:val="22"/>
             </w:rPr>
           </w:pPr>
-          <w:hyperlink w:anchor="_Toc242606776" w:history="1">
+          <w:hyperlink w:anchor="_Toc242887513" w:history="1">
             <w:r>
               <w:rPr>
                 <w:rStyle w:val="Hyperlink"/>
@@ -949,7 +942,7 @@
               <w:rPr>
                 <w:noProof/>
               </w:rPr>
-              <w:instrText xml:space="preserve"> PAGEREF _Toc242606776 \h </w:instrText>
+              <w:instrText xml:space="preserve"> PAGEREF _Toc242887513 \h </w:instrText>
             </w:r>
             <w:r>
               <w:rPr>
@@ -989,7 +982,7 @@
               <w:szCs w:val="22"/>
             </w:rPr>
           </w:pPr>
-          <w:hyperlink w:anchor="_Toc242606777" w:history="1">
+          <w:hyperlink w:anchor="_Toc242887514" w:history="1">
             <w:r>
               <w:rPr>
                 <w:rStyle w:val="Hyperlink"/>
@@ -1013,7 +1006,7 @@
               <w:rPr>
                 <w:noProof/>
               </w:rPr>
-              <w:instrText xml:space="preserve"> PAGEREF _Toc242606777 \h </w:instrText>
+              <w:instrText xml:space="preserve"> PAGEREF _Toc242887514 \h </w:instrText>
             </w:r>
             <w:r>
               <w:rPr>
@@ -1053,7 +1046,7 @@
               <w:szCs w:val="22"/>
             </w:rPr>
           </w:pPr>
-          <w:hyperlink w:anchor="_Toc242606778" w:history="1">
+          <w:hyperlink w:anchor="_Toc242887515" w:history="1">
             <w:r>
               <w:rPr>
                 <w:rStyle w:val="Hyperlink"/>
@@ -1077,7 +1070,7 @@
               <w:rPr>
                 <w:noProof/>
               </w:rPr>
-              <w:instrText xml:space="preserve"> PAGEREF _Toc242606778 \h </w:instrText>
+              <w:instrText xml:space="preserve"> PAGEREF _Toc242887515 \h </w:instrText>
             </w:r>
             <w:r>
               <w:rPr>
@@ -1117,7 +1110,7 @@
               <w:szCs w:val="22"/>
             </w:rPr>
           </w:pPr>
-          <w:hyperlink w:anchor="_Toc242606779" w:history="1">
+          <w:hyperlink w:anchor="_Toc242887516" w:history="1">
             <w:r>
               <w:rPr>
                 <w:rStyle w:val="Hyperlink"/>
@@ -1141,7 +1134,7 @@
               <w:rPr>
                 <w:noProof/>
               </w:rPr>
-              <w:instrText xml:space="preserve"> PAGEREF _Toc242606779 \h </w:instrText>
+              <w:instrText xml:space="preserve"> PAGEREF _Toc242887516 \h </w:instrText>
             </w:r>
             <w:r>
               <w:rPr>
@@ -1181,7 +1174,7 @@
               <w:szCs w:val="22"/>
             </w:rPr>
           </w:pPr>
-          <w:hyperlink w:anchor="_Toc242606780" w:history="1">
+          <w:hyperlink w:anchor="_Toc242887517" w:history="1">
             <w:r>
               <w:rPr>
                 <w:rStyle w:val="Hyperlink"/>
@@ -1205,7 +1198,7 @@
               <w:rPr>
                 <w:noProof/>
               </w:rPr>
-              <w:instrText xml:space="preserve"> PAGEREF _Toc242606780 \h </w:instrText>
+              <w:instrText xml:space="preserve"> PAGEREF _Toc242887517 \h </w:instrText>
             </w:r>
             <w:r>
               <w:rPr>
@@ -1245,7 +1238,7 @@
               <w:szCs w:val="22"/>
             </w:rPr>
           </w:pPr>
-          <w:hyperlink w:anchor="_Toc242606781" w:history="1">
+          <w:hyperlink w:anchor="_Toc242887518" w:history="1">
             <w:r>
               <w:rPr>
                 <w:rStyle w:val="Hyperlink"/>
@@ -1269,7 +1262,7 @@
               <w:rPr>
                 <w:noProof/>
               </w:rPr>
-              <w:instrText xml:space="preserve"> PAGEREF _Toc242606781 \h </w:instrText>
+              <w:instrText xml:space="preserve"> PAGEREF _Toc242887518 \h </w:instrText>
             </w:r>
             <w:r>
               <w:rPr>
@@ -1309,7 +1302,7 @@
               <w:szCs w:val="22"/>
             </w:rPr>
           </w:pPr>
-          <w:hyperlink w:anchor="_Toc242606782" w:history="1">
+          <w:hyperlink w:anchor="_Toc242887519" w:history="1">
             <w:r>
               <w:rPr>
                 <w:rStyle w:val="Hyperlink"/>
@@ -1333,7 +1326,7 @@
               <w:rPr>
                 <w:noProof/>
               </w:rPr>
-              <w:instrText xml:space="preserve"> PAGEREF _Toc242606782 \h </w:instrText>
+              <w:instrText xml:space="preserve"> PAGEREF _Toc242887519 \h </w:instrText>
             </w:r>
             <w:r>
               <w:rPr>
@@ -1350,7 +1343,7 @@
               <w:rPr>
                 <w:noProof/>
               </w:rPr>
-              <w:t>8</w:t>
+              <w:t>9</w:t>
             </w:r>
             <w:r>
               <w:rPr>
@@ -1373,7 +1366,7 @@
               <w:szCs w:val="22"/>
             </w:rPr>
           </w:pPr>
-          <w:hyperlink w:anchor="_Toc242606783" w:history="1">
+          <w:hyperlink w:anchor="_Toc242887520" w:history="1">
             <w:r>
               <w:rPr>
                 <w:rStyle w:val="Hyperlink"/>
@@ -1397,7 +1390,7 @@
               <w:rPr>
                 <w:noProof/>
               </w:rPr>
-              <w:instrText xml:space="preserve"> PAGEREF _Toc242606783 \h </w:instrText>
+              <w:instrText xml:space="preserve"> PAGEREF _Toc242887520 \h </w:instrText>
             </w:r>
             <w:r>
               <w:rPr>
@@ -1414,7 +1407,7 @@
               <w:rPr>
                 <w:noProof/>
               </w:rPr>
-              <w:t>9</w:t>
+              <w:t>10</w:t>
             </w:r>
             <w:r>
               <w:rPr>
@@ -1437,7 +1430,7 @@
               <w:szCs w:val="22"/>
             </w:rPr>
           </w:pPr>
-          <w:hyperlink w:anchor="_Toc242606784" w:history="1">
+          <w:hyperlink w:anchor="_Toc242887521" w:history="1">
             <w:r>
               <w:rPr>
                 <w:rStyle w:val="Hyperlink"/>
@@ -1461,7 +1454,7 @@
               <w:rPr>
                 <w:noProof/>
               </w:rPr>
-              <w:instrText xml:space="preserve"> PAGEREF _Toc242606784 \h </w:instrText>
+              <w:instrText xml:space="preserve"> PAGEREF _Toc242887521 \h </w:instrText>
             </w:r>
             <w:r>
               <w:rPr>
@@ -1501,7 +1494,7 @@
               <w:szCs w:val="22"/>
             </w:rPr>
           </w:pPr>
-          <w:hyperlink w:anchor="_Toc242606785" w:history="1">
+          <w:hyperlink w:anchor="_Toc242887522" w:history="1">
             <w:r>
               <w:rPr>
                 <w:rStyle w:val="Hyperlink"/>
@@ -1525,7 +1518,7 @@
               <w:rPr>
                 <w:noProof/>
               </w:rPr>
-              <w:instrText xml:space="preserve"> PAGEREF _Toc242606785 \h </w:instrText>
+              <w:instrText xml:space="preserve"> PAGEREF _Toc242887522 \h </w:instrText>
             </w:r>
             <w:r>
               <w:rPr>
@@ -1542,7 +1535,7 @@
               <w:rPr>
                 <w:noProof/>
               </w:rPr>
-              <w:t>12</w:t>
+              <w:t>13</w:t>
             </w:r>
             <w:r>
               <w:rPr>
@@ -1565,7 +1558,7 @@
               <w:szCs w:val="22"/>
             </w:rPr>
           </w:pPr>
-          <w:hyperlink w:anchor="_Toc242606786" w:history="1">
+          <w:hyperlink w:anchor="_Toc242887523" w:history="1">
             <w:r>
               <w:rPr>
                 <w:rStyle w:val="Hyperlink"/>
@@ -1589,7 +1582,7 @@
               <w:rPr>
                 <w:noProof/>
               </w:rPr>
-              <w:instrText xml:space="preserve"> PAGEREF _Toc242606786 \h </w:instrText>
+              <w:instrText xml:space="preserve"> PAGEREF _Toc242887523 \h </w:instrText>
             </w:r>
             <w:r>
               <w:rPr>
@@ -1606,7 +1599,7 @@
               <w:rPr>
                 <w:noProof/>
               </w:rPr>
-              <w:t>12</w:t>
+              <w:t>13</w:t>
             </w:r>
             <w:r>
               <w:rPr>
@@ -1629,7 +1622,7 @@
               <w:szCs w:val="22"/>
             </w:rPr>
           </w:pPr>
-          <w:hyperlink w:anchor="_Toc242606787" w:history="1">
+          <w:hyperlink w:anchor="_Toc242887524" w:history="1">
             <w:r>
               <w:rPr>
                 <w:rStyle w:val="Hyperlink"/>
@@ -1653,7 +1646,7 @@
               <w:rPr>
                 <w:noProof/>
               </w:rPr>
-              <w:instrText xml:space="preserve"> PAGEREF _Toc242606787 \h </w:instrText>
+              <w:instrText xml:space="preserve"> PAGEREF _Toc242887524 \h </w:instrText>
             </w:r>
             <w:r>
               <w:rPr>
@@ -1670,7 +1663,7 @@
               <w:rPr>
                 <w:noProof/>
               </w:rPr>
-              <w:t>13</w:t>
+              <w:t>14</w:t>
             </w:r>
             <w:r>
               <w:rPr>
@@ -1693,7 +1686,7 @@
               <w:szCs w:val="22"/>
             </w:rPr>
           </w:pPr>
-          <w:hyperlink w:anchor="_Toc242606788" w:history="1">
+          <w:hyperlink w:anchor="_Toc242887525" w:history="1">
             <w:r>
               <w:rPr>
                 <w:rStyle w:val="Hyperlink"/>
@@ -1717,7 +1710,7 @@
               <w:rPr>
                 <w:noProof/>
               </w:rPr>
-              <w:instrText xml:space="preserve"> PAGEREF _Toc242606788 \h </w:instrText>
+              <w:instrText xml:space="preserve"> PAGEREF _Toc242887525 \h </w:instrText>
             </w:r>
             <w:r>
               <w:rPr>
@@ -1734,7 +1727,7 @@
               <w:rPr>
                 <w:noProof/>
               </w:rPr>
-              <w:t>14</w:t>
+              <w:t>15</w:t>
             </w:r>
             <w:r>
               <w:rPr>
@@ -1757,7 +1750,7 @@
               <w:szCs w:val="22"/>
             </w:rPr>
           </w:pPr>
-          <w:hyperlink w:anchor="_Toc242606789" w:history="1">
+          <w:hyperlink w:anchor="_Toc242887526" w:history="1">
             <w:r>
               <w:rPr>
                 <w:rStyle w:val="Hyperlink"/>
@@ -1781,7 +1774,7 @@
               <w:rPr>
                 <w:noProof/>
               </w:rPr>
-              <w:instrText xml:space="preserve"> PAGEREF _Toc242606789 \h </w:instrText>
+              <w:instrText xml:space="preserve"> PAGEREF _Toc242887526 \h </w:instrText>
             </w:r>
             <w:r>
               <w:rPr>
@@ -1798,7 +1791,7 @@
               <w:rPr>
                 <w:noProof/>
               </w:rPr>
-              <w:t>14</w:t>
+              <w:t>15</w:t>
             </w:r>
             <w:r>
               <w:rPr>
@@ -1821,7 +1814,7 @@
               <w:szCs w:val="22"/>
             </w:rPr>
           </w:pPr>
-          <w:hyperlink w:anchor="_Toc242606790" w:history="1">
+          <w:hyperlink w:anchor="_Toc242887527" w:history="1">
             <w:r>
               <w:rPr>
                 <w:rStyle w:val="Hyperlink"/>
@@ -1845,7 +1838,7 @@
               <w:rPr>
                 <w:noProof/>
               </w:rPr>
-              <w:instrText xml:space="preserve"> PAGEREF _Toc242606790 \h </w:instrText>
+              <w:instrText xml:space="preserve"> PAGEREF _Toc242887527 \h </w:instrText>
             </w:r>
             <w:r>
               <w:rPr>
@@ -1862,7 +1855,7 @@
               <w:rPr>
                 <w:noProof/>
               </w:rPr>
-              <w:t>14</w:t>
+              <w:t>15</w:t>
             </w:r>
             <w:r>
               <w:rPr>
@@ -1885,7 +1878,7 @@
               <w:szCs w:val="22"/>
             </w:rPr>
           </w:pPr>
-          <w:hyperlink w:anchor="_Toc242606791" w:history="1">
+          <w:hyperlink w:anchor="_Toc242887528" w:history="1">
             <w:r>
               <w:rPr>
                 <w:rStyle w:val="Hyperlink"/>
@@ -1909,7 +1902,7 @@
               <w:rPr>
                 <w:noProof/>
               </w:rPr>
-              <w:instrText xml:space="preserve"> PAGEREF _Toc242606791 \h </w:instrText>
+              <w:instrText xml:space="preserve"> PAGEREF _Toc242887528 \h </w:instrText>
             </w:r>
             <w:r>
               <w:rPr>
@@ -1926,7 +1919,7 @@
               <w:rPr>
                 <w:noProof/>
               </w:rPr>
-              <w:t>16</w:t>
+              <w:t>17</w:t>
             </w:r>
             <w:r>
               <w:rPr>
@@ -1949,7 +1942,7 @@
               <w:szCs w:val="22"/>
             </w:rPr>
           </w:pPr>
-          <w:hyperlink w:anchor="_Toc242606792" w:history="1">
+          <w:hyperlink w:anchor="_Toc242887529" w:history="1">
             <w:r>
               <w:rPr>
                 <w:rStyle w:val="Hyperlink"/>
@@ -1973,7 +1966,7 @@
               <w:rPr>
                 <w:noProof/>
               </w:rPr>
-              <w:instrText xml:space="preserve"> PAGEREF _Toc242606792 \h </w:instrText>
+              <w:instrText xml:space="preserve"> PAGEREF _Toc242887529 \h </w:instrText>
             </w:r>
             <w:r>
               <w:rPr>
@@ -1990,7 +1983,7 @@
               <w:rPr>
                 <w:noProof/>
               </w:rPr>
-              <w:t>16</w:t>
+              <w:t>17</w:t>
             </w:r>
             <w:r>
               <w:rPr>
@@ -2013,7 +2006,7 @@
               <w:szCs w:val="22"/>
             </w:rPr>
           </w:pPr>
-          <w:hyperlink w:anchor="_Toc242606793" w:history="1">
+          <w:hyperlink w:anchor="_Toc242887530" w:history="1">
             <w:r>
               <w:rPr>
                 <w:rStyle w:val="Hyperlink"/>
@@ -2037,7 +2030,7 @@
               <w:rPr>
                 <w:noProof/>
               </w:rPr>
-              <w:instrText xml:space="preserve"> PAGEREF _Toc242606793 \h </w:instrText>
+              <w:instrText xml:space="preserve"> PAGEREF _Toc242887530 \h </w:instrText>
             </w:r>
             <w:r>
               <w:rPr>
@@ -2054,7 +2047,7 @@
               <w:rPr>
                 <w:noProof/>
               </w:rPr>
-              <w:t>16</w:t>
+              <w:t>17</w:t>
             </w:r>
             <w:r>
               <w:rPr>
@@ -2077,7 +2070,7 @@
               <w:szCs w:val="22"/>
             </w:rPr>
           </w:pPr>
-          <w:hyperlink w:anchor="_Toc242606794" w:history="1">
+          <w:hyperlink w:anchor="_Toc242887531" w:history="1">
             <w:r>
               <w:rPr>
                 <w:rStyle w:val="Hyperlink"/>
@@ -2101,7 +2094,7 @@
               <w:rPr>
                 <w:noProof/>
               </w:rPr>
-              <w:instrText xml:space="preserve"> PAGEREF _Toc242606794 \h </w:instrText>
+              <w:instrText xml:space="preserve"> PAGEREF _Toc242887531 \h </w:instrText>
             </w:r>
             <w:r>
               <w:rPr>
@@ -2118,7 +2111,7 @@
               <w:rPr>
                 <w:noProof/>
               </w:rPr>
-              <w:t>17</w:t>
+              <w:t>18</w:t>
             </w:r>
             <w:r>
               <w:rPr>
@@ -2141,7 +2134,7 @@
               <w:szCs w:val="22"/>
             </w:rPr>
           </w:pPr>
-          <w:hyperlink w:anchor="_Toc242606795" w:history="1">
+          <w:hyperlink w:anchor="_Toc242887532" w:history="1">
             <w:r>
               <w:rPr>
                 <w:rStyle w:val="Hyperlink"/>
@@ -2165,7 +2158,7 @@
               <w:rPr>
                 <w:noProof/>
               </w:rPr>
-              <w:instrText xml:space="preserve"> PAGEREF _Toc242606795 \h </w:instrText>
+              <w:instrText xml:space="preserve"> PAGEREF _Toc242887532 \h </w:instrText>
             </w:r>
             <w:r>
               <w:rPr>
@@ -2182,7 +2175,7 @@
               <w:rPr>
                 <w:noProof/>
               </w:rPr>
-              <w:t>18</w:t>
+              <w:t>19</w:t>
             </w:r>
             <w:r>
               <w:rPr>
@@ -2205,7 +2198,7 @@
               <w:szCs w:val="22"/>
             </w:rPr>
           </w:pPr>
-          <w:hyperlink w:anchor="_Toc242606796" w:history="1">
+          <w:hyperlink w:anchor="_Toc242887533" w:history="1">
             <w:r>
               <w:rPr>
                 <w:rStyle w:val="Hyperlink"/>
@@ -2229,7 +2222,7 @@
               <w:rPr>
                 <w:noProof/>
               </w:rPr>
-              <w:instrText xml:space="preserve"> PAGEREF _Toc242606796 \h </w:instrText>
+              <w:instrText xml:space="preserve"> PAGEREF _Toc242887533 \h </w:instrText>
             </w:r>
             <w:r>
               <w:rPr>
@@ -2246,7 +2239,7 @@
               <w:rPr>
                 <w:noProof/>
               </w:rPr>
-              <w:t>18</w:t>
+              <w:t>19</w:t>
             </w:r>
             <w:r>
               <w:rPr>
@@ -2269,7 +2262,7 @@
               <w:szCs w:val="22"/>
             </w:rPr>
           </w:pPr>
-          <w:hyperlink w:anchor="_Toc242606797" w:history="1">
+          <w:hyperlink w:anchor="_Toc242887534" w:history="1">
             <w:r>
               <w:rPr>
                 <w:rStyle w:val="Hyperlink"/>
@@ -2293,7 +2286,7 @@
               <w:rPr>
                 <w:noProof/>
               </w:rPr>
-              <w:instrText xml:space="preserve"> PAGEREF _Toc242606797 \h </w:instrText>
+              <w:instrText xml:space="preserve"> PAGEREF _Toc242887534 \h </w:instrText>
             </w:r>
             <w:r>
               <w:rPr>
@@ -2310,7 +2303,7 @@
               <w:rPr>
                 <w:noProof/>
               </w:rPr>
-              <w:t>18</w:t>
+              <w:t>19</w:t>
             </w:r>
             <w:r>
               <w:rPr>
@@ -2333,7 +2326,7 @@
               <w:szCs w:val="22"/>
             </w:rPr>
           </w:pPr>
-          <w:hyperlink w:anchor="_Toc242606798" w:history="1">
+          <w:hyperlink w:anchor="_Toc242887535" w:history="1">
             <w:r>
               <w:rPr>
                 <w:rStyle w:val="Hyperlink"/>
@@ -2357,7 +2350,7 @@
               <w:rPr>
                 <w:noProof/>
               </w:rPr>
-              <w:instrText xml:space="preserve"> PAGEREF _Toc242606798 \h </w:instrText>
+              <w:instrText xml:space="preserve"> PAGEREF _Toc242887535 \h </w:instrText>
             </w:r>
             <w:r>
               <w:rPr>
@@ -2374,7 +2367,7 @@
               <w:rPr>
                 <w:noProof/>
               </w:rPr>
-              <w:t>19</w:t>
+              <w:t>20</w:t>
             </w:r>
             <w:r>
               <w:rPr>
@@ -2397,7 +2390,7 @@
               <w:szCs w:val="22"/>
             </w:rPr>
           </w:pPr>
-          <w:hyperlink w:anchor="_Toc242606799" w:history="1">
+          <w:hyperlink w:anchor="_Toc242887536" w:history="1">
             <w:r>
               <w:rPr>
                 <w:rStyle w:val="Hyperlink"/>
@@ -2421,7 +2414,7 @@
               <w:rPr>
                 <w:noProof/>
               </w:rPr>
-              <w:instrText xml:space="preserve"> PAGEREF _Toc242606799 \h </w:instrText>
+              <w:instrText xml:space="preserve"> PAGEREF _Toc242887536 \h </w:instrText>
             </w:r>
             <w:r>
               <w:rPr>
@@ -2438,7 +2431,7 @@
               <w:rPr>
                 <w:noProof/>
               </w:rPr>
-              <w:t>19</w:t>
+              <w:t>20</w:t>
             </w:r>
             <w:r>
               <w:rPr>
@@ -2461,13 +2454,13 @@
               <w:szCs w:val="22"/>
             </w:rPr>
           </w:pPr>
-          <w:hyperlink w:anchor="_Toc242606800" w:history="1">
+          <w:hyperlink w:anchor="_Toc242887537" w:history="1">
             <w:r>
               <w:rPr>
                 <w:rStyle w:val="Hyperlink"/>
                 <w:noProof/>
               </w:rPr>
-              <w:t>7.5 Retro Adjustments</w:t>
+              <w:t>7.5 Payroll Adjustments</w:t>
             </w:r>
             <w:r>
               <w:rPr>
@@ -2485,7 +2478,7 @@
               <w:rPr>
                 <w:noProof/>
               </w:rPr>
-              <w:instrText xml:space="preserve"> PAGEREF _Toc242606800 \h </w:instrText>
+              <w:instrText xml:space="preserve"> PAGEREF _Toc242887537 \h </w:instrText>
             </w:r>
             <w:r>
               <w:rPr>
@@ -2502,7 +2495,7 @@
               <w:rPr>
                 <w:noProof/>
               </w:rPr>
-              <w:t>19</w:t>
+              <w:t>20</w:t>
             </w:r>
             <w:r>
               <w:rPr>
@@ -2525,7 +2518,7 @@
               <w:szCs w:val="22"/>
             </w:rPr>
           </w:pPr>
-          <w:hyperlink w:anchor="_Toc242606801" w:history="1">
+          <w:hyperlink w:anchor="_Toc242887538" w:history="1">
             <w:r>
               <w:rPr>
                 <w:rStyle w:val="Hyperlink"/>
@@ -2549,7 +2542,7 @@
               <w:rPr>
                 <w:noProof/>
               </w:rPr>
-              <w:instrText xml:space="preserve"> PAGEREF _Toc242606801 \h </w:instrText>
+              <w:instrText xml:space="preserve"> PAGEREF _Toc242887538 \h </w:instrText>
             </w:r>
             <w:r>
               <w:rPr>
@@ -2566,7 +2559,7 @@
               <w:rPr>
                 <w:noProof/>
               </w:rPr>
-              <w:t>20</w:t>
+              <w:t>21</w:t>
             </w:r>
             <w:r>
               <w:rPr>
@@ -2589,7 +2582,7 @@
               <w:szCs w:val="22"/>
             </w:rPr>
           </w:pPr>
-          <w:hyperlink w:anchor="_Toc242606802" w:history="1">
+          <w:hyperlink w:anchor="_Toc242887539" w:history="1">
             <w:r>
               <w:rPr>
                 <w:rStyle w:val="Hyperlink"/>
@@ -2613,7 +2606,7 @@
               <w:rPr>
                 <w:noProof/>
               </w:rPr>
-              <w:instrText xml:space="preserve"> PAGEREF _Toc242606802 \h </w:instrText>
+              <w:instrText xml:space="preserve"> PAGEREF _Toc242887539 \h </w:instrText>
             </w:r>
             <w:r>
               <w:rPr>
@@ -2630,7 +2623,7 @@
               <w:rPr>
                 <w:noProof/>
               </w:rPr>
-              <w:t>21</w:t>
+              <w:t>22</w:t>
             </w:r>
             <w:r>
               <w:rPr>
@@ -2653,7 +2646,7 @@
               <w:szCs w:val="22"/>
             </w:rPr>
           </w:pPr>
-          <w:hyperlink w:anchor="_Toc242606803" w:history="1">
+          <w:hyperlink w:anchor="_Toc242887540" w:history="1">
             <w:r>
               <w:rPr>
                 <w:rStyle w:val="Hyperlink"/>
@@ -2677,7 +2670,7 @@
               <w:rPr>
                 <w:noProof/>
               </w:rPr>
-              <w:instrText xml:space="preserve"> PAGEREF _Toc242606803 \h </w:instrText>
+              <w:instrText xml:space="preserve"> PAGEREF _Toc242887540 \h </w:instrText>
             </w:r>
             <w:r>
               <w:rPr>
@@ -2694,7 +2687,7 @@
               <w:rPr>
                 <w:noProof/>
               </w:rPr>
-              <w:t>21</w:t>
+              <w:t>22</w:t>
             </w:r>
             <w:r>
               <w:rPr>
@@ -2717,7 +2710,7 @@
               <w:szCs w:val="22"/>
             </w:rPr>
           </w:pPr>
-          <w:hyperlink w:anchor="_Toc242606804" w:history="1">
+          <w:hyperlink w:anchor="_Toc242887541" w:history="1">
             <w:r>
               <w:rPr>
                 <w:rStyle w:val="Hyperlink"/>
@@ -2741,7 +2734,7 @@
               <w:rPr>
                 <w:noProof/>
               </w:rPr>
-              <w:instrText xml:space="preserve"> PAGEREF _Toc242606804 \h </w:instrText>
+              <w:instrText xml:space="preserve"> PAGEREF _Toc242887541 \h </w:instrText>
             </w:r>
             <w:r>
               <w:rPr>
@@ -2758,7 +2751,7 @@
               <w:rPr>
                 <w:noProof/>
               </w:rPr>
-              <w:t>21</w:t>
+              <w:t>22</w:t>
             </w:r>
             <w:r>
               <w:rPr>
@@ -2781,7 +2774,7 @@
               <w:szCs w:val="22"/>
             </w:rPr>
           </w:pPr>
-          <w:hyperlink w:anchor="_Toc242606805" w:history="1">
+          <w:hyperlink w:anchor="_Toc242887542" w:history="1">
             <w:r>
               <w:rPr>
                 <w:rStyle w:val="Hyperlink"/>
@@ -2805,7 +2798,7 @@
               <w:rPr>
                 <w:noProof/>
               </w:rPr>
-              <w:instrText xml:space="preserve"> PAGEREF _Toc242606805 \h </w:instrText>
+              <w:instrText xml:space="preserve"> PAGEREF _Toc242887542 \h </w:instrText>
             </w:r>
             <w:r>
               <w:rPr>
@@ -2822,7 +2815,7 @@
               <w:rPr>
                 <w:noProof/>
               </w:rPr>
-              <w:t>23</w:t>
+              <w:t>24</w:t>
             </w:r>
             <w:r>
               <w:rPr>
@@ -2845,7 +2838,7 @@
               <w:szCs w:val="22"/>
             </w:rPr>
           </w:pPr>
-          <w:hyperlink w:anchor="_Toc242606806" w:history="1">
+          <w:hyperlink w:anchor="_Toc242887543" w:history="1">
             <w:r>
               <w:rPr>
                 <w:rStyle w:val="Hyperlink"/>
@@ -2869,7 +2862,7 @@
               <w:rPr>
                 <w:noProof/>
               </w:rPr>
-              <w:instrText xml:space="preserve"> PAGEREF _Toc242606806 \h </w:instrText>
+              <w:instrText xml:space="preserve"> PAGEREF _Toc242887543 \h </w:instrText>
             </w:r>
             <w:r>
               <w:rPr>
@@ -2886,7 +2879,7 @@
               <w:rPr>
                 <w:noProof/>
               </w:rPr>
-              <w:t>23</w:t>
+              <w:t>24</w:t>
             </w:r>
             <w:r>
               <w:rPr>
@@ -2912,7 +2905,7 @@
       <w:pPr>
         <w:pStyle w:val="Heading1"/>
       </w:pPr>
-      <w:bookmarkStart w:id="0" w:name="_Toc242606769"/>
+      <w:bookmarkStart w:id="0" w:name="_Toc242887506"/>
       <w:r>
         <w:lastRenderedPageBreak/>
         <w:t>1. How to Read This Document</w:t>
@@ -2950,10 +2943,7 @@
         <w:spacing w:after="60"/>
       </w:pPr>
       <w:r>
-        <w:t>What it means — what the value tells you, in pla</w:t>
-      </w:r>
-      <w:r>
-        <w:t>in words.</w:t>
+        <w:t>What it means — what the value tells you, in plain words.</w:t>
       </w:r>
     </w:p>
     <w:p>
@@ -2981,7 +2971,7 @@
       <w:pPr>
         <w:pStyle w:val="Heading2"/>
       </w:pPr>
-      <w:bookmarkStart w:id="1" w:name="_Toc242606770"/>
+      <w:bookmarkStart w:id="1" w:name="_Toc242887507"/>
       <w:r>
         <w:t>1.1 Terms used in the formulas</w:t>
       </w:r>
@@ -3304,14 +3294,7 @@
                 <w:sz w:val="19"/>
                 <w:szCs w:val="19"/>
               </w:rPr>
-              <w:t>Every report (Pay Sheet, Contribution History, Remittances, Year-end Tax, 13th Mon</w:t>
-            </w:r>
-            <w:r>
-              <w:rPr>
-                <w:sz w:val="19"/>
-                <w:szCs w:val="19"/>
-              </w:rPr>
-              <w:t>th, My Payslips) reads only approved payslips. Draft, Pending and Cancelled runs are not counted.</w:t>
+              <w:t>Every report (Pay Sheet, Contribution History, Remittances, Year-end Tax, 13th Month, My Payslips) reads only approved payslips. Draft, Pending and Cancelled runs are not counted.</w:t>
             </w:r>
           </w:p>
         </w:tc>
@@ -3491,14 +3474,7 @@
                 <w:sz w:val="19"/>
                 <w:szCs w:val="19"/>
               </w:rPr>
-              <w:t>Earnings marked taxable on the payslip: ba</w:t>
-            </w:r>
-            <w:r>
-              <w:rPr>
-                <w:sz w:val="19"/>
-                <w:szCs w:val="19"/>
-              </w:rPr>
-              <w:t>sic pay, absences / late / undertime (negative), holiday pay, overtime, night differential, taxable allowances and taxable adjustments.</w:t>
+              <w:t>Earnings marked taxable on the payslip: basic pay, absences / late / undertime (negative), holiday pay, overtime, night differential, taxable allowances and taxable adjustments.</w:t>
             </w:r>
           </w:p>
         </w:tc>
@@ -3558,14 +3534,7 @@
                 <w:sz w:val="19"/>
                 <w:szCs w:val="19"/>
               </w:rPr>
-              <w:t>Payroll Settings → Premium Rates: per day type, the % paid for a regular hour, an overtime hour, the nigh</w:t>
-            </w:r>
-            <w:r>
-              <w:rPr>
-                <w:sz w:val="19"/>
-                <w:szCs w:val="19"/>
-              </w:rPr>
-              <w:t>t differential added on top, and the % of the daily rate paid for an unworked holiday.</w:t>
+              <w:t>Payroll Settings → Premium Rates: per day type, the % paid for a regular hour, an overtime hour, the night differential added on top, and the % of the daily rate paid for an unworked holiday.</w:t>
             </w:r>
           </w:p>
         </w:tc>
@@ -3640,7 +3609,7 @@
       <w:pPr>
         <w:pStyle w:val="Heading1"/>
       </w:pPr>
-      <w:bookmarkStart w:id="2" w:name="_Toc242606771"/>
+      <w:bookmarkStart w:id="2" w:name="_Toc242887508"/>
       <w:r>
         <w:lastRenderedPageBreak/>
         <w:t>2. Time &amp; Leave</w:t>
@@ -3652,7 +3621,7 @@
         <w:pStyle w:val="Heading2"/>
         <w:spacing w:before="240"/>
       </w:pPr>
-      <w:bookmarkStart w:id="3" w:name="_Toc242606772"/>
+      <w:bookmarkStart w:id="3" w:name="_Toc242887509"/>
       <w:r>
         <w:t>2.1 Leave Applications</w:t>
       </w:r>
@@ -4144,14 +4113,7 @@
                 <w:sz w:val="19"/>
                 <w:szCs w:val="19"/>
               </w:rPr>
-              <w:t>Each date in the range, skipping the employee's day off (schedule in f</w:t>
-            </w:r>
-            <w:r>
-              <w:rPr>
-                <w:sz w:val="19"/>
-                <w:szCs w:val="19"/>
-              </w:rPr>
-              <w:t>orce that day) and holidays of their branch — unless the type counts calendar days (Maternity). A half day = 0.5. No schedule = no day skipped.</w:t>
+              <w:t>Each date in the range, skipping the employee's day off (schedule in force that day) and holidays of their branch — unless the type counts calendar days (Maternity). A half day = 0.5. No schedule = no day skipped.</w:t>
             </w:r>
           </w:p>
         </w:tc>
@@ -4237,14 +4199,7 @@
                 <w:sz w:val="19"/>
                 <w:szCs w:val="19"/>
               </w:rPr>
-              <w:t>Pending (at an approval level) → Approved / Disapproved; Pending or Approved → Cance</w:t>
-            </w:r>
-            <w:r>
-              <w:rPr>
-                <w:sz w:val="19"/>
-                <w:szCs w:val="19"/>
-              </w:rPr>
-              <w:t>lled (days return to the balance).</w:t>
+              <w:t>Pending (at an approval level) → Approved / Disapproved; Pending or Approved → Cancelled (days return to the balance).</w:t>
             </w:r>
           </w:p>
         </w:tc>
@@ -4341,7 +4296,7 @@
         <w:pStyle w:val="Heading2"/>
         <w:spacing w:before="240"/>
       </w:pPr>
-      <w:bookmarkStart w:id="4" w:name="_Toc242606773"/>
+      <w:bookmarkStart w:id="4" w:name="_Toc242887510"/>
       <w:r>
         <w:t>2.2 Leave Balances</w:t>
       </w:r>
@@ -4833,14 +4788,7 @@
                 <w:sz w:val="19"/>
                 <w:szCs w:val="19"/>
               </w:rPr>
-              <w:t>Credi</w:t>
-            </w:r>
-            <w:r>
-              <w:rPr>
-                <w:sz w:val="19"/>
-                <w:szCs w:val="19"/>
-              </w:rPr>
-              <w:t>ts − Used − Pending.</w:t>
+              <w:t>Credits − Used − Pending.</w:t>
             </w:r>
           </w:p>
         </w:tc>
@@ -4956,7 +4904,7 @@
         <w:pStyle w:val="Heading2"/>
         <w:spacing w:before="240"/>
       </w:pPr>
-      <w:bookmarkStart w:id="5" w:name="_Toc242606774"/>
+      <w:bookmarkStart w:id="5" w:name="_Toc242887511"/>
       <w:r>
         <w:lastRenderedPageBreak/>
         <w:t>2.3 Manual Time Entries</w:t>
@@ -4988,15 +4936,7 @@
           <w:bCs/>
           <w:color w:val="333333"/>
         </w:rPr>
-        <w:t xml:space="preserve">    </w:t>
-      </w:r>
-      <w:r>
-        <w:rPr>
-          <w:b/>
-          <w:bCs/>
-          <w:color w:val="333333"/>
-        </w:rPr>
-        <w:t xml:space="preserve"> View: </w:t>
+        <w:t xml:space="preserve">     View: </w:t>
       </w:r>
       <w:r>
         <w:rPr>
@@ -5457,14 +5397,7 @@
                 <w:sz w:val="19"/>
                 <w:szCs w:val="19"/>
               </w:rPr>
-              <w:t>Pending → Approved / Disapproved, or Cancelled. Only Approved entries are</w:t>
-            </w:r>
-            <w:r>
-              <w:rPr>
-                <w:sz w:val="19"/>
-                <w:szCs w:val="19"/>
-              </w:rPr>
-              <w:t xml:space="preserve"> used by Timekeeping and payroll.</w:t>
+              <w:t>Pending → Approved / Disapproved, or Cancelled. Only Approved entries are used by Timekeeping and payroll.</w:t>
             </w:r>
           </w:p>
         </w:tc>
@@ -5561,7 +5494,7 @@
         <w:pStyle w:val="Heading2"/>
         <w:spacing w:before="240"/>
       </w:pPr>
-      <w:bookmarkStart w:id="6" w:name="_Toc242606775"/>
+      <w:bookmarkStart w:id="6" w:name="_Toc242887512"/>
       <w:r>
         <w:t>2.4 Overtime</w:t>
       </w:r>
@@ -6053,14 +5986,7 @@
                 <w:sz w:val="19"/>
                 <w:szCs w:val="19"/>
               </w:rPr>
-              <w:t>From the schedule and Holiday Calendar on that date (Ordinary Day, Rest Day, Special / Regular / Double Holiday …). Payroll use</w:t>
-            </w:r>
-            <w:r>
-              <w:rPr>
-                <w:sz w:val="19"/>
-                <w:szCs w:val="19"/>
-              </w:rPr>
-              <w:t>s the day type of the date again when it runs.</w:t>
+              <w:t>From the schedule and Holiday Calendar on that date (Ordinary Day, Rest Day, Special / Regular / Double Holiday …). Payroll uses the day type of the date again when it runs.</w:t>
             </w:r>
           </w:p>
         </w:tc>
@@ -6157,7 +6083,7 @@
         <w:pStyle w:val="Heading2"/>
         <w:spacing w:before="240"/>
       </w:pPr>
-      <w:bookmarkStart w:id="7" w:name="_Toc242606776"/>
+      <w:bookmarkStart w:id="7" w:name="_Toc242887513"/>
       <w:r>
         <w:t>2.5 Shifts, Shifting and Default Schedules</w:t>
       </w:r>
@@ -6391,21 +6317,7 @@
                 <w:sz w:val="19"/>
                 <w:szCs w:val="19"/>
               </w:rPr>
-              <w:t xml:space="preserve">Each day: day off, or time in – time out with break minutes. Hours per day = span </w:t>
-            </w:r>
-            <w:r>
-              <w:rPr>
-                <w:sz w:val="19"/>
-                <w:szCs w:val="19"/>
-              </w:rPr>
-              <w:t>−</w:t>
-            </w:r>
-            <w:r>
-              <w:rPr>
-                <w:sz w:val="19"/>
-                <w:szCs w:val="19"/>
-              </w:rPr>
-              <w:t xml:space="preserve"> break.</w:t>
+              <w:t>Each day: day off, or time in – time out with break minutes. Hours per day = span − break.</w:t>
             </w:r>
           </w:p>
         </w:tc>
@@ -6577,14 +6489,7 @@
                 <w:sz w:val="19"/>
                 <w:szCs w:val="19"/>
               </w:rPr>
-              <w:t>Overrides the Work Schedule on those dates; "Relieving" names the empl</w:t>
-            </w:r>
-            <w:r>
-              <w:rPr>
-                <w:sz w:val="19"/>
-                <w:szCs w:val="19"/>
-              </w:rPr>
-              <w:t>oyee being covered.</w:t>
+              <w:t>Overrides the Work Schedule on those dates; "Relieving" names the employee being covered.</w:t>
             </w:r>
           </w:p>
         </w:tc>
@@ -6682,7 +6587,7 @@
         <w:pStyle w:val="Heading2"/>
         <w:spacing w:before="240"/>
       </w:pPr>
-      <w:bookmarkStart w:id="8" w:name="_Toc242606777"/>
+      <w:bookmarkStart w:id="8" w:name="_Toc242887514"/>
       <w:r>
         <w:t>2.6 Payroll Cut-offs and Holiday Calendar</w:t>
       </w:r>
@@ -6719,13 +6624,7 @@
         <w:rPr>
           <w:color w:val="333333"/>
         </w:rPr>
-        <w:t>Li</w:t>
-      </w:r>
-      <w:r>
-        <w:rPr>
-          <w:color w:val="333333"/>
-        </w:rPr>
-        <w:t>sts</w:t>
+        <w:t>Lists</w:t>
       </w:r>
     </w:p>
     <w:tbl>
@@ -7094,14 +6993,7 @@
                 <w:sz w:val="19"/>
                 <w:szCs w:val="19"/>
               </w:rPr>
-              <w:t xml:space="preserve">Open / Closed. Approving </w:t>
-            </w:r>
-            <w:r>
-              <w:rPr>
-                <w:sz w:val="19"/>
-                <w:szCs w:val="19"/>
-              </w:rPr>
-              <w:t>the payroll closes it.</w:t>
+              <w:t>Open / Closed. Approving the payroll closes it.</w:t>
             </w:r>
           </w:p>
         </w:tc>
@@ -7273,14 +7165,7 @@
                 <w:sz w:val="19"/>
                 <w:szCs w:val="19"/>
               </w:rPr>
-              <w:t xml:space="preserve">All branches, or </w:t>
-            </w:r>
-            <w:r>
-              <w:rPr>
-                <w:sz w:val="19"/>
-                <w:szCs w:val="19"/>
-              </w:rPr>
-              <w:t>the branches listed (local holidays).</w:t>
+              <w:t>All branches, or the branches listed (local holidays).</w:t>
             </w:r>
           </w:p>
         </w:tc>
@@ -7295,7 +7180,7 @@
       <w:pPr>
         <w:pStyle w:val="Heading1"/>
       </w:pPr>
-      <w:bookmarkStart w:id="9" w:name="_Toc242606778"/>
+      <w:bookmarkStart w:id="9" w:name="_Toc242887515"/>
       <w:r>
         <w:lastRenderedPageBreak/>
         <w:t>3. Payroll → Processing</w:t>
@@ -7307,7 +7192,7 @@
         <w:pStyle w:val="Heading2"/>
         <w:spacing w:before="240"/>
       </w:pPr>
-      <w:bookmarkStart w:id="10" w:name="_Toc242606779"/>
+      <w:bookmarkStart w:id="10" w:name="_Toc242887516"/>
       <w:r>
         <w:t>3.1 Timekeeping — employee list</w:t>
       </w:r>
@@ -7498,16 +7383,7 @@
                 <w:sz w:val="19"/>
                 <w:szCs w:val="19"/>
               </w:rPr>
-              <w:t>Presen</w:t>
-            </w:r>
-            <w:r>
-              <w:rPr>
-                <w:b/>
-                <w:bCs/>
-                <w:sz w:val="19"/>
-                <w:szCs w:val="19"/>
-              </w:rPr>
-              <w:t>t</w:t>
+              <w:t>Present</w:t>
             </w:r>
           </w:p>
         </w:tc>
@@ -7817,14 +7693,7 @@
                 <w:sz w:val="19"/>
                 <w:szCs w:val="19"/>
               </w:rPr>
-              <w:t>Sum of</w:t>
-            </w:r>
-            <w:r>
-              <w:rPr>
-                <w:sz w:val="19"/>
-                <w:szCs w:val="19"/>
-              </w:rPr>
-              <w:t xml:space="preserve"> late minutes (see the day view).</w:t>
+              <w:t>Sum of late minutes (see the day view).</w:t>
             </w:r>
           </w:p>
         </w:tc>
@@ -8179,7 +8048,7 @@
         <w:pStyle w:val="Heading2"/>
         <w:spacing w:before="240"/>
       </w:pPr>
-      <w:bookmarkStart w:id="11" w:name="_Toc242606780"/>
+      <w:bookmarkStart w:id="11" w:name="_Toc242887517"/>
       <w:r>
         <w:t>3.2 Timekeeping — day view (DTR)</w:t>
       </w:r>
@@ -8202,13 +8071,7 @@
         <w:rPr>
           <w:color w:val="333333"/>
         </w:rPr>
-        <w:t>Timeke</w:t>
-      </w:r>
-      <w:r>
-        <w:rPr>
-          <w:color w:val="333333"/>
-        </w:rPr>
-        <w:t>eping → View (also on a payslip)</w:t>
+        <w:t>Timekeeping → View (also on a payslip)</w:t>
       </w:r>
       <w:r>
         <w:rPr>
@@ -8651,14 +8514,7 @@
                 <w:sz w:val="19"/>
                 <w:szCs w:val="19"/>
               </w:rPr>
-              <w:t>What the day c</w:t>
-            </w:r>
-            <w:r>
-              <w:rPr>
-                <w:sz w:val="19"/>
-                <w:szCs w:val="19"/>
-              </w:rPr>
-              <w:t>ounts as</w:t>
+              <w:t>What the day counts as</w:t>
             </w:r>
           </w:p>
         </w:tc>
@@ -8684,14 +8540,7 @@
                 <w:sz w:val="19"/>
                 <w:szCs w:val="19"/>
               </w:rPr>
-              <w:t>Present, Absent, On Leave, Half-day Leave, Incomplete (one punch only — flagged, not deducted), Holiday, Holiday Worked, Rest Day, Rest Day Worked (paid only through approved overtime), No Schedule (flagged, nothing deducted), Upcoming (today or later — as</w:t>
-            </w:r>
-            <w:r>
-              <w:rPr>
-                <w:sz w:val="19"/>
-                <w:szCs w:val="19"/>
-              </w:rPr>
-              <w:t>sumed worked).</w:t>
+              <w:t>Present, Absent, On Leave, Half-day Leave, Incomplete (one punch only — flagged, not deducted), Holiday, Holiday Worked, Rest Day, Rest Day Worked (paid only through approved overtime), No Schedule (flagged, nothing deducted), Upcoming (today or later — assumed worked).</w:t>
             </w:r>
           </w:p>
         </w:tc>
@@ -9096,14 +8945,7 @@
                 <w:sz w:val="19"/>
                 <w:szCs w:val="19"/>
               </w:rPr>
-              <w:t>R</w:t>
-            </w:r>
-            <w:r>
-              <w:rPr>
-                <w:sz w:val="19"/>
-                <w:szCs w:val="19"/>
-              </w:rPr>
-              <w:t>egular minutes in the night window</w:t>
+              <w:t>Regular minutes in the night window</w:t>
             </w:r>
           </w:p>
         </w:tc>
@@ -9312,7 +9154,7 @@
         <w:pStyle w:val="Heading2"/>
         <w:spacing w:before="240"/>
       </w:pPr>
-      <w:bookmarkStart w:id="12" w:name="_Toc242606781"/>
+      <w:bookmarkStart w:id="12" w:name="_Toc242887518"/>
       <w:r>
         <w:t>3.3 Payroll Runs — list</w:t>
       </w:r>
@@ -9335,13 +9177,7 @@
         <w:rPr>
           <w:color w:val="333333"/>
         </w:rPr>
-        <w:t>Payroll → Processing → Payroll R</w:t>
-      </w:r>
-      <w:r>
-        <w:rPr>
-          <w:color w:val="333333"/>
-        </w:rPr>
-        <w:t>uns</w:t>
+        <w:t>Payroll → Processing → Payroll Runs</w:t>
       </w:r>
       <w:r>
         <w:rPr>
@@ -9586,7 +9422,7 @@
                 <w:sz w:val="19"/>
                 <w:szCs w:val="19"/>
               </w:rPr>
-              <w:t>Pay Date</w:t>
+              <w:t>Company</w:t>
             </w:r>
           </w:p>
         </w:tc>
@@ -9612,7 +9448,7 @@
                 <w:sz w:val="19"/>
                 <w:szCs w:val="19"/>
               </w:rPr>
-              <w:t>When it is paid</w:t>
+              <w:t>Whose employees the run pays</w:t>
             </w:r>
           </w:p>
         </w:tc>
@@ -9638,7 +9474,7 @@
                 <w:sz w:val="19"/>
                 <w:szCs w:val="19"/>
               </w:rPr>
-              <w:t>The cut-off's pay date.</w:t>
+              <w:t>All companies, or one company (each employee's branch's company when generated). A cut-off has one all-companies run or one run per company, never both.</w:t>
             </w:r>
           </w:p>
         </w:tc>
@@ -9672,7 +9508,7 @@
                 <w:sz w:val="19"/>
                 <w:szCs w:val="19"/>
               </w:rPr>
-              <w:t>Status</w:t>
+              <w:t>Pay Date</w:t>
             </w:r>
           </w:p>
         </w:tc>
@@ -9698,7 +9534,7 @@
                 <w:sz w:val="19"/>
                 <w:szCs w:val="19"/>
               </w:rPr>
-              <w:t>Where the run is</w:t>
+              <w:t>When it is paid</w:t>
             </w:r>
           </w:p>
         </w:tc>
@@ -9724,14 +9560,7 @@
                 <w:sz w:val="19"/>
                 <w:szCs w:val="19"/>
               </w:rPr>
-              <w:t>Draft (can be generated again) → Pending (waiting for the approvers) → Approved (locked); a Draft can be Cancelled. An Approved run can be rolled back to Draft (all or selected employees) only before its pay date — from the pay date it counts as paid and i</w:t>
-            </w:r>
-            <w:r>
-              <w:rPr>
-                <w:sz w:val="19"/>
-                <w:szCs w:val="19"/>
-              </w:rPr>
-              <w:t>s corrected by a retro adjustment instead.</w:t>
+              <w:t>The cut-off's pay date.</w:t>
             </w:r>
           </w:p>
         </w:tc>
@@ -9765,7 +9594,7 @@
                 <w:sz w:val="19"/>
                 <w:szCs w:val="19"/>
               </w:rPr>
-              <w:t>Employees</w:t>
+              <w:t>Status</w:t>
             </w:r>
           </w:p>
         </w:tc>
@@ -9791,7 +9620,7 @@
                 <w:sz w:val="19"/>
                 <w:szCs w:val="19"/>
               </w:rPr>
-              <w:t>People in the run</w:t>
+              <w:t>Where the run is</w:t>
             </w:r>
           </w:p>
         </w:tc>
@@ -9817,7 +9646,7 @@
                 <w:sz w:val="19"/>
                 <w:szCs w:val="19"/>
               </w:rPr>
-              <w:t>Number of payslips, across every approval round.</w:t>
+              <w:t>Draft (can be generated again) → Pending (waiting for the approvers) → Approved (locked); a Draft can be Cancelled. An Approved run can be rolled back to Draft (all or selected employees) only before its pay date — from the pay date it counts as paid and is corrected by a payroll adjustment instead.</w:t>
             </w:r>
           </w:p>
         </w:tc>
@@ -9851,7 +9680,7 @@
                 <w:sz w:val="19"/>
                 <w:szCs w:val="19"/>
               </w:rPr>
-              <w:t>Gross</w:t>
+              <w:t>Employees</w:t>
             </w:r>
           </w:p>
         </w:tc>
@@ -9877,7 +9706,7 @@
                 <w:sz w:val="19"/>
                 <w:szCs w:val="19"/>
               </w:rPr>
-              <w:t>Total earnings</w:t>
+              <w:t>People in the run</w:t>
             </w:r>
           </w:p>
         </w:tc>
@@ -9903,7 +9732,7 @@
                 <w:sz w:val="19"/>
                 <w:szCs w:val="19"/>
               </w:rPr>
-              <w:t>Sum of every payslip's gross pay.</w:t>
+              <w:t>Number of payslips, across every approval round.</w:t>
             </w:r>
           </w:p>
         </w:tc>
@@ -9937,7 +9766,7 @@
                 <w:sz w:val="19"/>
                 <w:szCs w:val="19"/>
               </w:rPr>
-              <w:t>Deductions</w:t>
+              <w:t>Gross</w:t>
             </w:r>
           </w:p>
         </w:tc>
@@ -9963,7 +9792,7 @@
                 <w:sz w:val="19"/>
                 <w:szCs w:val="19"/>
               </w:rPr>
-              <w:t>Total deductions</w:t>
+              <w:t>Total earnings</w:t>
             </w:r>
           </w:p>
         </w:tc>
@@ -9989,7 +9818,7 @@
                 <w:sz w:val="19"/>
                 <w:szCs w:val="19"/>
               </w:rPr>
-              <w:t>Sum of every payslip's total deductions.</w:t>
+              <w:t>Sum of every payslip's gross pay.</w:t>
             </w:r>
           </w:p>
         </w:tc>
@@ -10023,6 +9852,92 @@
                 <w:sz w:val="19"/>
                 <w:szCs w:val="19"/>
               </w:rPr>
+              <w:t>Deductions</w:t>
+            </w:r>
+          </w:p>
+        </w:tc>
+        <w:tc>
+          <w:tcPr>
+            <w:tcW w:w="4300" w:type="dxa"/>
+            <w:tcBorders>
+              <w:top w:val="single" w:sz="6" w:space="0" w:color="A6A6A6"/>
+              <w:left w:val="single" w:sz="6" w:space="0" w:color="A6A6A6"/>
+              <w:bottom w:val="single" w:sz="6" w:space="0" w:color="A6A6A6"/>
+              <w:right w:val="single" w:sz="6" w:space="0" w:color="A6A6A6"/>
+            </w:tcBorders>
+            <w:tcMar>
+              <w:top w:w="60" w:type="dxa"/>
+              <w:left w:w="100" w:type="dxa"/>
+              <w:bottom w:w="60" w:type="dxa"/>
+              <w:right w:w="100" w:type="dxa"/>
+            </w:tcMar>
+          </w:tcPr>
+          <w:p>
+            <w:r>
+              <w:rPr>
+                <w:sz w:val="19"/>
+                <w:szCs w:val="19"/>
+              </w:rPr>
+              <w:t>Total deductions</w:t>
+            </w:r>
+          </w:p>
+        </w:tc>
+        <w:tc>
+          <w:tcPr>
+            <w:tcW w:w="7910" w:type="dxa"/>
+            <w:tcBorders>
+              <w:top w:val="single" w:sz="6" w:space="0" w:color="A6A6A6"/>
+              <w:left w:val="single" w:sz="6" w:space="0" w:color="A6A6A6"/>
+              <w:bottom w:val="single" w:sz="6" w:space="0" w:color="A6A6A6"/>
+              <w:right w:val="single" w:sz="6" w:space="0" w:color="A6A6A6"/>
+            </w:tcBorders>
+            <w:tcMar>
+              <w:top w:w="60" w:type="dxa"/>
+              <w:left w:w="100" w:type="dxa"/>
+              <w:bottom w:w="60" w:type="dxa"/>
+              <w:right w:w="100" w:type="dxa"/>
+            </w:tcMar>
+          </w:tcPr>
+          <w:p>
+            <w:r>
+              <w:rPr>
+                <w:sz w:val="19"/>
+                <w:szCs w:val="19"/>
+              </w:rPr>
+              <w:t>Sum of every payslip's total deductions.</w:t>
+            </w:r>
+          </w:p>
+        </w:tc>
+      </w:tr>
+      <w:tr>
+        <w:trPr>
+          <w:cantSplit/>
+        </w:trPr>
+        <w:tc>
+          <w:tcPr>
+            <w:tcW w:w="2900" w:type="dxa"/>
+            <w:tcBorders>
+              <w:top w:val="single" w:sz="6" w:space="0" w:color="A6A6A6"/>
+              <w:left w:val="single" w:sz="6" w:space="0" w:color="A6A6A6"/>
+              <w:bottom w:val="single" w:sz="6" w:space="0" w:color="A6A6A6"/>
+              <w:right w:val="single" w:sz="6" w:space="0" w:color="A6A6A6"/>
+            </w:tcBorders>
+            <w:shd w:val="clear" w:color="auto" w:fill="F2F2F2"/>
+            <w:tcMar>
+              <w:top w:w="60" w:type="dxa"/>
+              <w:left w:w="100" w:type="dxa"/>
+              <w:bottom w:w="60" w:type="dxa"/>
+              <w:right w:w="100" w:type="dxa"/>
+            </w:tcMar>
+          </w:tcPr>
+          <w:p>
+            <w:r>
+              <w:rPr>
+                <w:b/>
+                <w:bCs/>
+                <w:sz w:val="19"/>
+                <w:szCs w:val="19"/>
+              </w:rPr>
               <w:t>Net Pay</w:t>
             </w:r>
           </w:p>
@@ -10076,6 +9991,92 @@
                 <w:szCs w:val="19"/>
               </w:rPr>
               <w:t>Gross − Deductions (sum of every payslip's net pay).</w:t>
+            </w:r>
+          </w:p>
+        </w:tc>
+      </w:tr>
+      <w:tr>
+        <w:trPr>
+          <w:cantSplit/>
+        </w:trPr>
+        <w:tc>
+          <w:tcPr>
+            <w:tcW w:w="2900" w:type="dxa"/>
+            <w:tcBorders>
+              <w:top w:val="single" w:sz="6" w:space="0" w:color="A6A6A6"/>
+              <w:left w:val="single" w:sz="6" w:space="0" w:color="A6A6A6"/>
+              <w:bottom w:val="single" w:sz="6" w:space="0" w:color="A6A6A6"/>
+              <w:right w:val="single" w:sz="6" w:space="0" w:color="A6A6A6"/>
+            </w:tcBorders>
+            <w:shd w:val="clear" w:color="auto" w:fill="F2F2F2"/>
+            <w:tcMar>
+              <w:top w:w="60" w:type="dxa"/>
+              <w:left w:w="100" w:type="dxa"/>
+              <w:bottom w:w="60" w:type="dxa"/>
+              <w:right w:w="100" w:type="dxa"/>
+            </w:tcMar>
+          </w:tcPr>
+          <w:p>
+            <w:r>
+              <w:rPr>
+                <w:b/>
+                <w:bCs/>
+                <w:sz w:val="19"/>
+                <w:szCs w:val="19"/>
+              </w:rPr>
+              <w:t>Paid From</w:t>
+            </w:r>
+          </w:p>
+        </w:tc>
+        <w:tc>
+          <w:tcPr>
+            <w:tcW w:w="4300" w:type="dxa"/>
+            <w:tcBorders>
+              <w:top w:val="single" w:sz="6" w:space="0" w:color="A6A6A6"/>
+              <w:left w:val="single" w:sz="6" w:space="0" w:color="A6A6A6"/>
+              <w:bottom w:val="single" w:sz="6" w:space="0" w:color="A6A6A6"/>
+              <w:right w:val="single" w:sz="6" w:space="0" w:color="A6A6A6"/>
+            </w:tcBorders>
+            <w:tcMar>
+              <w:top w:w="60" w:type="dxa"/>
+              <w:left w:w="100" w:type="dxa"/>
+              <w:bottom w:w="60" w:type="dxa"/>
+              <w:right w:w="100" w:type="dxa"/>
+            </w:tcMar>
+          </w:tcPr>
+          <w:p>
+            <w:r>
+              <w:rPr>
+                <w:sz w:val="19"/>
+                <w:szCs w:val="19"/>
+              </w:rPr>
+              <w:t>Company accounts that paid it</w:t>
+            </w:r>
+          </w:p>
+        </w:tc>
+        <w:tc>
+          <w:tcPr>
+            <w:tcW w:w="7910" w:type="dxa"/>
+            <w:tcBorders>
+              <w:top w:val="single" w:sz="6" w:space="0" w:color="A6A6A6"/>
+              <w:left w:val="single" w:sz="6" w:space="0" w:color="A6A6A6"/>
+              <w:bottom w:val="single" w:sz="6" w:space="0" w:color="A6A6A6"/>
+              <w:right w:val="single" w:sz="6" w:space="0" w:color="A6A6A6"/>
+            </w:tcBorders>
+            <w:tcMar>
+              <w:top w:w="60" w:type="dxa"/>
+              <w:left w:w="100" w:type="dxa"/>
+              <w:bottom w:w="60" w:type="dxa"/>
+              <w:right w:w="100" w:type="dxa"/>
+            </w:tcMar>
+          </w:tcPr>
+          <w:p>
+            <w:r>
+              <w:rPr>
+                <w:sz w:val="19"/>
+                <w:szCs w:val="19"/>
+              </w:rPr>
+              <w:t>From the approved payslips' saved accounts: each paying account (its company, or General) with its employee count; "on approval" until approved.</w:t>
             </w:r>
           </w:p>
         </w:tc>
@@ -10172,8 +10173,9 @@
         <w:pStyle w:val="Heading2"/>
         <w:spacing w:before="240"/>
       </w:pPr>
-      <w:bookmarkStart w:id="13" w:name="_Toc242606782"/>
+      <w:bookmarkStart w:id="13" w:name="_Toc242887519"/>
       <w:r>
+        <w:lastRenderedPageBreak/>
         <w:t>3.4 Payroll Run — pay register</w:t>
       </w:r>
       <w:bookmarkEnd w:id="13"/>
@@ -10195,13 +10197,7 @@
         <w:rPr>
           <w:color w:val="333333"/>
         </w:rPr>
-        <w:t>Payroll Runs</w:t>
-      </w:r>
-      <w:r>
-        <w:rPr>
-          <w:color w:val="333333"/>
-        </w:rPr>
-        <w:t xml:space="preserve"> → View</w:t>
+        <w:t>Payroll Runs → View</w:t>
       </w:r>
       <w:r>
         <w:rPr>
@@ -10532,7 +10528,6 @@
                 <w:sz w:val="19"/>
                 <w:szCs w:val="19"/>
               </w:rPr>
-              <w:lastRenderedPageBreak/>
               <w:t>Late / UT</w:t>
             </w:r>
           </w:p>
@@ -11015,14 +11010,7 @@
                 <w:sz w:val="19"/>
                 <w:szCs w:val="19"/>
               </w:rPr>
-              <w:t>Number of warnings: e.g. rest day worked without approved overtime (not paid), missing time in</w:t>
-            </w:r>
-            <w:r>
-              <w:rPr>
-                <w:sz w:val="19"/>
-                <w:szCs w:val="19"/>
-              </w:rPr>
-              <w:t xml:space="preserve"> / out, no Work Schedule, a deduction not taken because net pay would go below zero, no contribution / tax table in force.</w:t>
+              <w:t>Number of warnings: e.g. rest day worked without approved overtime (not paid), missing time in / out, no Work Schedule, a deduction not taken because net pay would go below zero, no contribution / tax table in force.</w:t>
             </w:r>
           </w:p>
         </w:tc>
@@ -11108,14 +11096,7 @@
                 <w:sz w:val="19"/>
                 <w:szCs w:val="19"/>
               </w:rPr>
-              <w:t>Shown on a Draft or Pending run: approved in round 1 (2 …). It is</w:t>
-            </w:r>
-            <w:r>
-              <w:rPr>
-                <w:sz w:val="19"/>
-                <w:szCs w:val="19"/>
-              </w:rPr>
-              <w:t>n't computed again until it is rolled back.</w:t>
+              <w:t>Shown on a Draft or Pending run: approved in round 1 (2 …). It isn't computed again until it is rolled back.</w:t>
             </w:r>
           </w:p>
         </w:tc>
@@ -11433,14 +11414,7 @@
                 <w:sz w:val="19"/>
                 <w:szCs w:val="19"/>
               </w:rPr>
-              <w:t>What the round cove</w:t>
-            </w:r>
-            <w:r>
-              <w:rPr>
-                <w:sz w:val="19"/>
-                <w:szCs w:val="19"/>
-              </w:rPr>
-              <w:t>rs</w:t>
+              <w:t>What the round covers</w:t>
             </w:r>
           </w:p>
         </w:tc>
@@ -11574,10 +11548,7 @@
         <w:t xml:space="preserve">Note: </w:t>
       </w:r>
       <w:r>
-        <w:t>Adding employees: Generate on an approved cut-off (or Add Employees on the run) lists only employees not in it. They are computed now, the run goes back to Draft, and the final approval releases only them as</w:t>
-      </w:r>
-      <w:r>
-        <w:t xml:space="preserve"> the next round. Remove Selected takes not-yet-approved payslips out of a Draft. The round filter also sets which payslips the Payroll Register and Bank File cover.</w:t>
+        <w:t>Adding employees (only before the pay date): Generate on an approved cut-off (or Add Employees on the run) lists only employees not in it. They are computed now, the run goes back to Draft, and the final approval releases only them as the next round. Remove Selected takes not-yet-approved payslips out of a Draft. The round filter also sets which payslips the Payroll Register and Bank File cover. The Payroll Register Excel also lists each employee's Credited To (their account) and Paid From (the company account).</w:t>
       </w:r>
     </w:p>
     <w:p>
@@ -11585,8 +11556,9 @@
         <w:pStyle w:val="Heading2"/>
         <w:spacing w:before="240"/>
       </w:pPr>
-      <w:bookmarkStart w:id="14" w:name="_Toc242606783"/>
+      <w:bookmarkStart w:id="14" w:name="_Toc242887520"/>
       <w:r>
+        <w:lastRenderedPageBreak/>
         <w:t>3.5 Payslip lines</w:t>
       </w:r>
       <w:bookmarkEnd w:id="14"/>
@@ -11622,13 +11594,7 @@
         <w:rPr>
           <w:color w:val="333333"/>
         </w:rPr>
-        <w:t>Record view (one emplo</w:t>
-      </w:r>
-      <w:r>
-        <w:rPr>
-          <w:color w:val="333333"/>
-        </w:rPr>
-        <w:t>yee)</w:t>
+        <w:t>Record view (one employee)</w:t>
       </w:r>
     </w:p>
     <w:p>
@@ -12006,14 +11972,7 @@
                 <w:sz w:val="19"/>
                 <w:szCs w:val="19"/>
               </w:rPr>
-              <w:t>−</w:t>
-            </w:r>
-            <w:r>
-              <w:rPr>
-                <w:sz w:val="19"/>
-                <w:szCs w:val="19"/>
-              </w:rPr>
-              <w:t xml:space="preserve"> absent days × daily rate.</w:t>
+              <w:t>− absent days × daily rate.</w:t>
             </w:r>
           </w:p>
         </w:tc>
@@ -12047,7 +12006,6 @@
                 <w:sz w:val="19"/>
                 <w:szCs w:val="19"/>
               </w:rPr>
-              <w:lastRenderedPageBreak/>
               <w:t>Unpaid Leave</w:t>
             </w:r>
           </w:p>
@@ -12100,14 +12058,7 @@
                 <w:sz w:val="19"/>
                 <w:szCs w:val="19"/>
               </w:rPr>
-              <w:t>−</w:t>
-            </w:r>
-            <w:r>
-              <w:rPr>
-                <w:sz w:val="19"/>
-                <w:szCs w:val="19"/>
-              </w:rPr>
-              <w:t xml:space="preserve"> unpaid leave days × daily rate.</w:t>
+              <w:t>− unpaid leave days × daily rate.</w:t>
             </w:r>
           </w:p>
         </w:tc>
@@ -12167,14 +12118,7 @@
                 <w:sz w:val="19"/>
                 <w:szCs w:val="19"/>
               </w:rPr>
-              <w:t xml:space="preserve">Deduction for time </w:t>
-            </w:r>
-            <w:r>
-              <w:rPr>
-                <w:sz w:val="19"/>
-                <w:szCs w:val="19"/>
-              </w:rPr>
-              <w:t>not worked</w:t>
+              <w:t>Deduction for time not worked</w:t>
             </w:r>
           </w:p>
         </w:tc>
@@ -12200,14 +12144,7 @@
                 <w:sz w:val="19"/>
                 <w:szCs w:val="19"/>
               </w:rPr>
-              <w:t>−</w:t>
-            </w:r>
-            <w:r>
-              <w:rPr>
-                <w:sz w:val="19"/>
-                <w:szCs w:val="19"/>
-              </w:rPr>
-              <w:t xml:space="preserve"> minutes ÷ 60 × hourly rate.</w:t>
+              <w:t>− minutes ÷ 60 × hourly rate.</w:t>
             </w:r>
           </w:p>
         </w:tc>
@@ -12499,16 +12436,7 @@
                 <w:sz w:val="19"/>
                 <w:szCs w:val="19"/>
               </w:rPr>
-              <w:t>Holiday Pay — not worked (daily-pai</w:t>
-            </w:r>
-            <w:r>
-              <w:rPr>
-                <w:b/>
-                <w:bCs/>
-                <w:sz w:val="19"/>
-                <w:szCs w:val="19"/>
-              </w:rPr>
-              <w:t>d)</w:t>
+              <w:t>Holiday Pay — not worked (daily-paid)</w:t>
             </w:r>
           </w:p>
         </w:tc>
@@ -12732,14 +12660,7 @@
                 <w:sz w:val="19"/>
                 <w:szCs w:val="19"/>
               </w:rPr>
-              <w:t>Hours × hourly rate × the day type's overtime rate (Ordin</w:t>
-            </w:r>
-            <w:r>
-              <w:rPr>
-                <w:sz w:val="19"/>
-                <w:szCs w:val="19"/>
-              </w:rPr>
-              <w:t>ary 125%, Rest Day 169% …). On a day off, the first 8 hours are at the day type's regular rate (e.g. Rest Day 130%), the rest at its overtime rate.</w:t>
+              <w:t>Hours × hourly rate × the day type's overtime rate (Ordinary 125%, Rest Day 169% …). On a day off, the first 8 hours are at the day type's regular rate (e.g. Rest Day 130%), the rest at its overtime rate.</w:t>
             </w:r>
           </w:p>
         </w:tc>
@@ -12825,14 +12746,7 @@
                 <w:sz w:val="19"/>
                 <w:szCs w:val="19"/>
               </w:rPr>
-              <w:t>Per cut-off: amount. Per month: amount ÷ cut-offs in</w:t>
-            </w:r>
-            <w:r>
-              <w:rPr>
-                <w:sz w:val="19"/>
-                <w:szCs w:val="19"/>
-              </w:rPr>
-              <w:t xml:space="preserve"> the month. Per week: amount × 52 ÷ 12 ÷ cut-offs. Per day worked: amount × days worked. Each × (days covered ÷ cut-off days) when the allowance starts or ends inside the cut-off. De minimis over its monthly limit: the excess is a separate taxable line.</w:t>
+              <w:t>Per cut-off: amount. Per month: amount ÷ cut-offs in the month. Per week: amount × 52 ÷ 12 ÷ cut-offs. Per day worked: amount × days worked. Each × (days covered ÷ cut-off days) when the allowance starts or ends inside the cut-off. De minimis over its monthly limit: the excess is a separate taxable line.</w:t>
             </w:r>
           </w:p>
         </w:tc>
@@ -12866,16 +12780,7 @@
                 <w:sz w:val="19"/>
                 <w:szCs w:val="19"/>
               </w:rPr>
-              <w:t>R</w:t>
-            </w:r>
-            <w:r>
-              <w:rPr>
-                <w:b/>
-                <w:bCs/>
-                <w:sz w:val="19"/>
-                <w:szCs w:val="19"/>
-              </w:rPr>
-              <w:t>etro lines</w:t>
+              <w:t>Payroll adjustment lines</w:t>
             </w:r>
           </w:p>
         </w:tc>
@@ -12901,7 +12806,7 @@
                 <w:sz w:val="19"/>
                 <w:szCs w:val="19"/>
               </w:rPr>
-              <w:t>Open retro adjustments of the cut-off</w:t>
+              <w:t>Open payroll adjustments of the cut-off</w:t>
             </w:r>
           </w:p>
         </w:tc>
@@ -12927,7 +12832,7 @@
                 <w:sz w:val="19"/>
                 <w:szCs w:val="19"/>
               </w:rPr>
-              <w:t>The retro amount; a Deduction-type retro is negative. Taxable per the retro.</w:t>
+              <w:t>The adjustment amount, labelled with its type (or what an Other Adjustment is for, e.g. Holiday Pay (manual)); a Deduction one is negative. Taxable per the adjustment.</w:t>
             </w:r>
           </w:p>
         </w:tc>
@@ -13099,14 +13004,7 @@
                 <w:sz w:val="19"/>
                 <w:szCs w:val="19"/>
               </w:rPr>
-              <w:t>The monthly EE amount (section 7.2) taken on the cut-off set in Payroll Settings: every cut-off = ÷ cut-offs; 1st or 2nd cut-off = the</w:t>
-            </w:r>
-            <w:r>
-              <w:rPr>
-                <w:sz w:val="19"/>
-                <w:szCs w:val="19"/>
-              </w:rPr>
-              <w:t xml:space="preserve"> whole month on that cut-off.</w:t>
+              <w:t>The monthly EE amount (section 7.2) taken on the cut-off set in Payroll Settings: every cut-off = ÷ cut-offs; 1st or 2nd cut-off = the whole month on that cut-off.</w:t>
             </w:r>
           </w:p>
         </w:tc>
@@ -13226,6 +13124,7 @@
                 <w:sz w:val="19"/>
                 <w:szCs w:val="19"/>
               </w:rPr>
+              <w:lastRenderedPageBreak/>
               <w:t>Withholding Tax</w:t>
             </w:r>
           </w:p>
@@ -13278,14 +13177,7 @@
                 <w:sz w:val="19"/>
                 <w:szCs w:val="19"/>
               </w:rPr>
-              <w:t>Every cut-off: monthly tax on (taxable pay × cut-offs in the month − monthly EE contributions) ÷ cut-offs. 2nd cut-off only: monthly tax on (this + earlier cut-off's taxable pay − EE contributions) − tax already withheld this month. BIR monthly table in fo</w:t>
-            </w:r>
-            <w:r>
-              <w:rPr>
-                <w:sz w:val="19"/>
-                <w:szCs w:val="19"/>
-              </w:rPr>
-              <w:t>rce on the cut-off's end. Minimum wage earner / Exempt = 0; Fixed = the profile amount.</w:t>
+              <w:t>Every cut-off: monthly tax on (taxable pay × cut-offs in the month − monthly EE contributions) ÷ cut-offs. 2nd cut-off only: monthly tax on (this + earlier cut-off's taxable pay − EE contributions) − tax already withheld this month. BIR monthly table in force on the cut-off's end. Minimum wage earner / Exempt = 0; Fixed = the profile amount.</w:t>
             </w:r>
           </w:p>
         </w:tc>
@@ -13371,14 +13263,7 @@
                 <w:sz w:val="19"/>
                 <w:szCs w:val="19"/>
               </w:rPr>
-              <w:t>Each Active deduction started on or before the cut-off and scheduled on it: min(amount per cut-off, balance). Skipped (with</w:t>
-            </w:r>
-            <w:r>
-              <w:rPr>
-                <w:sz w:val="19"/>
-                <w:szCs w:val="19"/>
-              </w:rPr>
-              <w:t xml:space="preserve"> a warning) if it would make net pay negative.</w:t>
+              <w:t>Each Active deduction started on or before the cut-off and scheduled on it: min(amount per cut-off, balance). Skipped (with a warning) if it would make net pay negative.</w:t>
             </w:r>
           </w:p>
         </w:tc>
@@ -13464,7 +13349,7 @@
                 <w:sz w:val="19"/>
                 <w:szCs w:val="19"/>
               </w:rPr>
-              <w:t>ER + EC of each agency on the same schedule. Not deducted from the employee.</w:t>
+              <w:t>ER + EC of each agency on the same schedule. Not deducted from the employee. Shown on the employee's own payslip (My Payslips, printed payslips, their pay sheet) only when Payroll Settings → Payslip turns it on; payroll staff always see it.</w:t>
             </w:r>
           </w:p>
         </w:tc>
@@ -13567,7 +13452,6 @@
           <w:bCs/>
           <w:color w:val="1A4D0F"/>
         </w:rPr>
-        <w:lastRenderedPageBreak/>
         <w:t>Worked example — monthly-paid, 2nd cut-off (figures are illustrative)</w:t>
       </w:r>
     </w:p>
@@ -13607,10 +13491,7 @@
         <w:spacing w:after="60"/>
       </w:pPr>
       <w:r>
-        <w:t xml:space="preserve">2 h overtime </w:t>
-      </w:r>
-      <w:r>
-        <w:t>on an ordinary day: 2 × 124.60 × 125% = ₱311.50. Rice ₱2,000 / month ÷ 2 = ₱1,000.00 (non-taxable).</w:t>
+        <w:t>2 h overtime on an ordinary day: 2 × 124.60 × 125% = ₱311.50. Rice ₱2,000 / month ÷ 2 = ₱1,000.00 (non-taxable).</w:t>
       </w:r>
     </w:p>
     <w:p>
@@ -13636,10 +13517,7 @@
         <w:spacing w:after="60"/>
       </w:pPr>
       <w:r>
-        <w:t>Contributions on the 2nd cut-off (whole month): e.g. SSS ₱1,300.00, PhilHealth ₱650.00, Pag-I</w:t>
-      </w:r>
-      <w:r>
-        <w:t>BIG ₱200.00.</w:t>
+        <w:t>Contributions on the 2nd cut-off (whole month): e.g. SSS ₱1,300.00, PhilHealth ₱650.00, Pag-IBIG ₱200.00.</w:t>
       </w:r>
     </w:p>
     <w:p>
@@ -13673,7 +13551,7 @@
         <w:pStyle w:val="Heading2"/>
         <w:spacing w:before="240"/>
       </w:pPr>
-      <w:bookmarkStart w:id="15" w:name="_Toc242606784"/>
+      <w:bookmarkStart w:id="15" w:name="_Toc242887521"/>
       <w:r>
         <w:t>3.6 Bank File</w:t>
       </w:r>
@@ -14165,14 +14043,7 @@
                 <w:sz w:val="19"/>
                 <w:szCs w:val="19"/>
               </w:rPr>
-              <w:t xml:space="preserve">The default payroll account for </w:t>
-            </w:r>
-            <w:r>
-              <w:rPr>
-                <w:sz w:val="19"/>
-                <w:szCs w:val="19"/>
-              </w:rPr>
-              <w:t>the pay date, or — when "match employee bank" is on — the company account at the employee's bank. Kept when the run is approved; each approval round keeps its own.</w:t>
+              <w:t>The employee's company's own account (Payroll Settings → Employers): the one at the employee's bank when "match employee bank" is on, else the company's default for the pay date (a default period covering it, else its Default). A company with no account, or none marked Default, uses the general accounts the same way. Kept when the run is approved — and on each payslip; each approval round keeps its own.</w:t>
             </w:r>
           </w:p>
         </w:tc>
@@ -14206,6 +14077,7 @@
                 <w:sz w:val="19"/>
                 <w:szCs w:val="19"/>
               </w:rPr>
+              <w:lastRenderedPageBreak/>
               <w:t>Round (filter)</w:t>
             </w:r>
           </w:p>
@@ -14258,14 +14130,7 @@
                 <w:sz w:val="19"/>
                 <w:szCs w:val="19"/>
               </w:rPr>
-              <w:t>All, or one approval round. A round's CSV can</w:t>
-            </w:r>
-            <w:r>
-              <w:rPr>
-                <w:sz w:val="19"/>
-                <w:szCs w:val="19"/>
-              </w:rPr>
-              <w:t xml:space="preserve"> be downloaded as soon as that round is approved, even while employees added later wait for approval.</w:t>
+              <w:t>All, or one approval round. A round's CSV can be downloaded as soon as that round is approved, even while employees added later wait for approval.</w:t>
             </w:r>
           </w:p>
         </w:tc>
@@ -14280,7 +14145,7 @@
       <w:pPr>
         <w:pStyle w:val="Heading1"/>
       </w:pPr>
-      <w:bookmarkStart w:id="16" w:name="_Toc242606785"/>
+      <w:bookmarkStart w:id="16" w:name="_Toc242887522"/>
       <w:r>
         <w:lastRenderedPageBreak/>
         <w:t>4. Payroll → Payroll Reports</w:t>
@@ -14292,7 +14157,7 @@
         <w:pStyle w:val="Heading2"/>
         <w:spacing w:before="240"/>
       </w:pPr>
-      <w:bookmarkStart w:id="17" w:name="_Toc242606786"/>
+      <w:bookmarkStart w:id="17" w:name="_Toc242887523"/>
       <w:r>
         <w:t>4.1 Pay Sheet</w:t>
       </w:r>
@@ -14338,10 +14203,7 @@
         <w:spacing w:after="100"/>
       </w:pPr>
       <w:r>
-        <w:t>Approved payslips whose cut-off ends inside the date / cut-off range, added up per employee (one line however many cut-offs). The group tabs subtotal the same lines by the employee's current co</w:t>
-      </w:r>
-      <w:r>
-        <w:t>mpany, branch or position, or by cut-off.</w:t>
+        <w:t>Approved payslips whose cut-off ends inside the date / cut-off range, added up per employee (one line however many cut-offs). The group tabs subtotal the same lines by the payslip's company (its employer when generated) and the employee's current branch or position, or by cut-off.</w:t>
       </w:r>
     </w:p>
     <w:tbl>
@@ -14856,14 +14718,7 @@
                 <w:sz w:val="19"/>
                 <w:szCs w:val="19"/>
               </w:rPr>
-              <w:t>Leave pay (daily-p</w:t>
-            </w:r>
-            <w:r>
-              <w:rPr>
-                <w:sz w:val="19"/>
-                <w:szCs w:val="19"/>
-              </w:rPr>
-              <w:t>aid)</w:t>
+              <w:t>Leave pay (daily-paid)</w:t>
             </w:r>
           </w:p>
         </w:tc>
@@ -15207,7 +15062,7 @@
                 <w:sz w:val="19"/>
                 <w:szCs w:val="19"/>
               </w:rPr>
-              <w:t>Retro and other adjustments</w:t>
+              <w:t>Payroll adjustments</w:t>
             </w:r>
           </w:p>
         </w:tc>
@@ -15233,7 +15088,7 @@
                 <w:sz w:val="19"/>
                 <w:szCs w:val="19"/>
               </w:rPr>
-              <w:t>Every other earning line (retros).</w:t>
+              <w:t>Every other earning line (payroll adjustments).</w:t>
             </w:r>
           </w:p>
         </w:tc>
@@ -15846,7 +15701,7 @@
         <w:pStyle w:val="Heading2"/>
         <w:spacing w:before="240"/>
       </w:pPr>
-      <w:bookmarkStart w:id="18" w:name="_Toc242606787"/>
+      <w:bookmarkStart w:id="18" w:name="_Toc242887524"/>
       <w:r>
         <w:lastRenderedPageBreak/>
         <w:t>4.2 Contribution History</w:t>
@@ -15870,13 +15725,7 @@
         <w:rPr>
           <w:color w:val="333333"/>
         </w:rPr>
-        <w:t>Payroll → Payroll Repo</w:t>
-      </w:r>
-      <w:r>
-        <w:rPr>
-          <w:color w:val="333333"/>
-        </w:rPr>
-        <w:t>rts → Contribution History (also Contributions → History)</w:t>
+        <w:t>Payroll → Payroll Reports → Contribution History (also Contributions → History)</w:t>
       </w:r>
       <w:r>
         <w:rPr>
@@ -16704,13 +16553,10 @@
       <w:pPr>
         <w:pStyle w:val="Heading1"/>
       </w:pPr>
-      <w:bookmarkStart w:id="19" w:name="_Toc242606788"/>
+      <w:bookmarkStart w:id="19" w:name="_Toc242887525"/>
       <w:r>
         <w:lastRenderedPageBreak/>
-        <w:t>5. Payroll → Go</w:t>
-      </w:r>
-      <w:r>
-        <w:t>vernment Compliance</w:t>
+        <w:t>5. Payroll → Government Compliance</w:t>
       </w:r>
       <w:bookmarkEnd w:id="19"/>
     </w:p>
@@ -16719,7 +16565,7 @@
         <w:pStyle w:val="Heading2"/>
         <w:spacing w:before="240"/>
       </w:pPr>
-      <w:bookmarkStart w:id="20" w:name="_Toc242606789"/>
+      <w:bookmarkStart w:id="20" w:name="_Toc242887526"/>
       <w:r>
         <w:t>5.1 Remittances</w:t>
       </w:r>
@@ -16765,7 +16611,7 @@
         <w:spacing w:after="100"/>
       </w:pPr>
       <w:r>
-        <w:t>All approved cut-offs ending in the calendar month, per employee. Download = one Excel workbook (summary + a sheet per agency).</w:t>
+        <w:t>All approved cut-offs ending in the calendar month, per employee, for the company chosen (each company is its own employer; its TIN and agency numbers from Payroll Settings → Employers head the Excel). Cleared = all companies. Download = one Excel workbook (summary + a sheet per agency).</w:t>
       </w:r>
     </w:p>
     <w:tbl>
@@ -17564,14 +17410,7 @@
                 <w:sz w:val="19"/>
                 <w:szCs w:val="19"/>
               </w:rPr>
-              <w:t>Non-taxable earnings (e.g. de minimis allowances) + manda</w:t>
-            </w:r>
-            <w:r>
-              <w:rPr>
-                <w:sz w:val="19"/>
-                <w:szCs w:val="19"/>
-              </w:rPr>
-              <w:t>tory EE contributions.</w:t>
+              <w:t>Non-taxable earnings (e.g. de minimis allowances) + mandatory EE contributions.</w:t>
             </w:r>
           </w:p>
         </w:tc>
@@ -17754,7 +17593,7 @@
         <w:pStyle w:val="Heading2"/>
         <w:spacing w:before="240"/>
       </w:pPr>
-      <w:bookmarkStart w:id="21" w:name="_Toc242606790"/>
+      <w:bookmarkStart w:id="21" w:name="_Toc242887527"/>
       <w:r>
         <w:t>5.2 Year-end Tax</w:t>
       </w:r>
@@ -17800,10 +17639,7 @@
         <w:spacing w:after="100"/>
       </w:pPr>
       <w:r>
-        <w:t xml:space="preserve">Annualization: the whole year's income tax compared with the tax already withheld, from approved payrolls and the approved 13th month of the </w:t>
-      </w:r>
-      <w:r>
-        <w:t>year. Feeds the alphalist Excel and the printable BIR 2316 data.</w:t>
+        <w:t>Annualization: the whole year's income tax compared with the tax already withheld, from approved payrolls and the approved 13th month of the year. Feeds the alphalist Excel and the printable BIR 2316 data. Filtered by company: only that employer's payslips; a transferred employee gets a 2316 from each company.</w:t>
       </w:r>
     </w:p>
     <w:tbl>
@@ -18172,14 +18008,7 @@
                 <w:sz w:val="19"/>
                 <w:szCs w:val="19"/>
               </w:rPr>
-              <w:t>Sum of the employee-share deductions on the payslips. The employer shar</w:t>
-            </w:r>
-            <w:r>
-              <w:rPr>
-                <w:sz w:val="19"/>
-                <w:szCs w:val="19"/>
-              </w:rPr>
-              <w:t>e isn't included. These are deducted from taxable income by law.</w:t>
+              <w:t>Sum of the employee-share deductions on the payslips. The employer share isn't included. These are deducted from taxable income by law.</w:t>
             </w:r>
           </w:p>
         </w:tc>
@@ -18266,14 +18095,7 @@
                 <w:sz w:val="19"/>
                 <w:szCs w:val="19"/>
               </w:rPr>
-              <w:t>Gross Compensation − Taxable. It includes non-taxable allowances (Rice, Uniform, Laundry and other types not marked Taxable), the contri</w:t>
-            </w:r>
-            <w:r>
-              <w:rPr>
-                <w:sz w:val="19"/>
-                <w:szCs w:val="19"/>
-              </w:rPr>
-              <w:t>butions, and the 13th month up to ₱90,000. For a minimum wage earner the whole gross is non-taxable.</w:t>
+              <w:t>Gross Compensation − Taxable. It includes non-taxable allowances (Rice, Uniform, Laundry and other types not marked Taxable), the contributions, and the 13th month up to ₱90,000. For a minimum wage earner the whole gross is non-taxable.</w:t>
             </w:r>
           </w:p>
         </w:tc>
@@ -18591,14 +18413,7 @@
                 <w:sz w:val="19"/>
                 <w:szCs w:val="19"/>
               </w:rPr>
-              <w:t>What's left</w:t>
-            </w:r>
-            <w:r>
-              <w:rPr>
-                <w:sz w:val="19"/>
-                <w:szCs w:val="19"/>
-              </w:rPr>
-              <w:t xml:space="preserve"> to settle</w:t>
+              <w:t>What's left to settle</w:t>
             </w:r>
           </w:p>
         </w:tc>
@@ -18732,10 +18547,7 @@
         <w:spacing w:after="60"/>
       </w:pPr>
       <w:r>
-        <w:t>Difference: +₱290 still</w:t>
-      </w:r>
-      <w:r>
-        <w:t xml:space="preserve"> to collect (negative if too much was withheld)</w:t>
+        <w:t>Difference: +₱290 still to collect (negative if too much was withheld)</w:t>
       </w:r>
     </w:p>
     <w:p>
@@ -18747,7 +18559,7 @@
       <w:pPr>
         <w:pStyle w:val="Heading1"/>
       </w:pPr>
-      <w:bookmarkStart w:id="22" w:name="_Toc242606791"/>
+      <w:bookmarkStart w:id="22" w:name="_Toc242887528"/>
       <w:r>
         <w:lastRenderedPageBreak/>
         <w:t>6. Payroll → Special Pay</w:t>
@@ -18759,7 +18571,7 @@
         <w:pStyle w:val="Heading2"/>
         <w:spacing w:before="240"/>
       </w:pPr>
-      <w:bookmarkStart w:id="23" w:name="_Toc242606792"/>
+      <w:bookmarkStart w:id="23" w:name="_Toc242887529"/>
       <w:r>
         <w:t>6.1 13th Month Pay — batches</w:t>
       </w:r>
@@ -18805,13 +18617,7 @@
         <w:spacing w:after="100"/>
       </w:pPr>
       <w:r>
-        <w:t>Generate 13th Month: choose the year, pay date (on or before December 2</w:t>
-      </w:r>
-      <w:r>
-        <w:t>4) and All employees or Selected employees. Selected = only those are computed; on an existing Draft the others keep their amounts. Submit sends it to the "13th Month Pay" approval (same approvers as Payroll Run); the last approval releases it. Roll Back S</w:t>
-      </w:r>
-      <w:r>
-        <w:t>elected / All reopens approved employees (the batch goes back to Draft and through approval again) — only before the pay date (December 24 when none is set); after that it is paid and can't be rolled back or generated again.</w:t>
+        <w:t>Generate 13th Month: choose the year, pay date (on or before December 24) and All employees or Selected employees. Selected = only those are computed; on an existing Draft the others keep their amounts. Submit sends it to the "13th Month Pay" approval (same approvers as Payroll Run); the last approval releases it. Roll Back Selected / All reopens approved employees (the batch goes back to Draft and through approval again) — only before the pay date (December 24 when none is set); after that it is paid and can't be rolled back or generated again.</w:t>
       </w:r>
     </w:p>
     <w:tbl>
@@ -18922,17 +18728,7 @@
                 <w:sz w:val="19"/>
                 <w:szCs w:val="19"/>
               </w:rPr>
-              <w:t>How it's c</w:t>
-            </w:r>
-            <w:r>
-              <w:rPr>
-                <w:b/>
-                <w:bCs/>
-                <w:color w:val="FFFFFF"/>
-                <w:sz w:val="19"/>
-                <w:szCs w:val="19"/>
-              </w:rPr>
-              <w:t>omputed</w:t>
+              <w:t>How it's computed</w:t>
             </w:r>
           </w:p>
         </w:tc>
@@ -19018,7 +18814,7 @@
                 <w:sz w:val="19"/>
                 <w:szCs w:val="19"/>
               </w:rPr>
-              <w:t>One batch per year (not counting cancelled ones).</w:t>
+              <w:t>One batch per year for all companies, or one per company (not counting cancelled ones).</w:t>
             </w:r>
           </w:p>
         </w:tc>
@@ -19104,14 +18900,7 @@
                 <w:sz w:val="19"/>
                 <w:szCs w:val="19"/>
               </w:rPr>
-              <w:t>Draft (can be generated again) → Pending → Approved; Disapproved returns it to Draft; a Draft with no approved employees can be Cancelled. A Draft may still hold employees marked "Approved" (kept through a partial rollback) — they are locked and keep their</w:t>
-            </w:r>
-            <w:r>
-              <w:rPr>
-                <w:sz w:val="19"/>
-                <w:szCs w:val="19"/>
-              </w:rPr>
-              <w:t xml:space="preserve"> amounts.</w:t>
+              <w:t>Draft (can be generated again) → Pending → Approved; Disapproved returns it to Draft; a Draft with no approved employees can be Cancelled. A Draft may still hold employees marked "Approved" (kept through a partial rollback) — they are locked and keep their amounts.</w:t>
             </w:r>
           </w:p>
         </w:tc>
@@ -19343,14 +19132,7 @@
                 <w:sz w:val="19"/>
                 <w:szCs w:val="19"/>
               </w:rPr>
-              <w:t>People and amount i</w:t>
-            </w:r>
-            <w:r>
-              <w:rPr>
-                <w:sz w:val="19"/>
-                <w:szCs w:val="19"/>
-              </w:rPr>
-              <w:t>n the batch</w:t>
+              <w:t>People and amount in the batch</w:t>
             </w:r>
           </w:p>
         </w:tc>
@@ -19387,7 +19169,7 @@
         <w:pStyle w:val="Heading2"/>
         <w:spacing w:before="240"/>
       </w:pPr>
-      <w:bookmarkStart w:id="24" w:name="_Toc242606793"/>
+      <w:bookmarkStart w:id="24" w:name="_Toc242887530"/>
       <w:r>
         <w:t>6.2 13th Month Pay — batch view</w:t>
       </w:r>
@@ -20172,16 +19954,7 @@
                 <w:szCs w:val="19"/>
               </w:rPr>
               <w:lastRenderedPageBreak/>
-              <w:t>Approval Rounds: Total / Earned</w:t>
-            </w:r>
-            <w:r>
-              <w:rPr>
-                <w:b/>
-                <w:bCs/>
-                <w:sz w:val="19"/>
-                <w:szCs w:val="19"/>
-              </w:rPr>
-              <w:t xml:space="preserve"> Through</w:t>
+              <w:t>Approval Rounds: Total / Earned Through</w:t>
             </w:r>
           </w:p>
         </w:tc>
@@ -20255,10 +20028,7 @@
         <w:t xml:space="preserve">Note: </w:t>
       </w:r>
       <w:r>
-        <w:t>Adding employees: Add Employees on an approved batch (or Generate fo</w:t>
-      </w:r>
-      <w:r>
-        <w:t>r that year) lists only employees not in it; the batch keeps its pay date, goes back to Draft, and the final approval releases them as the next round.</w:t>
+        <w:t>Adding employees (only before the pay date): Add Employees on an approved batch (or Generate for that year) lists only employees not in it; the batch keeps its pay date, goes back to Draft, and the final approval releases them as the next round.</w:t>
       </w:r>
     </w:p>
     <w:p>
@@ -20266,7 +20036,7 @@
         <w:pStyle w:val="Heading2"/>
         <w:spacing w:before="240"/>
       </w:pPr>
-      <w:bookmarkStart w:id="25" w:name="_Toc242606794"/>
+      <w:bookmarkStart w:id="25" w:name="_Toc242887531"/>
       <w:r>
         <w:t>6.3 Final Pay</w:t>
       </w:r>
@@ -20758,14 +20528,7 @@
                 <w:sz w:val="19"/>
                 <w:szCs w:val="19"/>
               </w:rPr>
-              <w:t>The payslip rules (section 3.5) for each part of a c</w:t>
-            </w:r>
-            <w:r>
-              <w:rPr>
-                <w:sz w:val="19"/>
-                <w:szCs w:val="19"/>
-              </w:rPr>
-              <w:t>ut-off, prorated against the full cut-off.</w:t>
+              <w:t>The payslip rules (section 3.5) for each part of a cut-off, prorated against the full cut-off.</w:t>
             </w:r>
           </w:p>
         </w:tc>
@@ -21083,14 +20846,7 @@
                 <w:sz w:val="19"/>
                 <w:szCs w:val="19"/>
               </w:rPr>
-              <w:t>Out</w:t>
-            </w:r>
-            <w:r>
-              <w:rPr>
-                <w:sz w:val="19"/>
-                <w:szCs w:val="19"/>
-              </w:rPr>
-              <w:t>standing balances</w:t>
+              <w:t>Outstanding balances</w:t>
             </w:r>
           </w:p>
         </w:tc>
@@ -21303,7 +21059,7 @@
       <w:pPr>
         <w:pStyle w:val="Heading1"/>
       </w:pPr>
-      <w:bookmarkStart w:id="26" w:name="_Toc242606795"/>
+      <w:bookmarkStart w:id="26" w:name="_Toc242887532"/>
       <w:r>
         <w:lastRenderedPageBreak/>
         <w:t>7. Payroll → Records</w:t>
@@ -21315,7 +21071,7 @@
         <w:pStyle w:val="Heading2"/>
         <w:spacing w:before="240"/>
       </w:pPr>
-      <w:bookmarkStart w:id="27" w:name="_Toc242606796"/>
+      <w:bookmarkStart w:id="27" w:name="_Toc242887533"/>
       <w:r>
         <w:t>7.1 Salary History</w:t>
       </w:r>
@@ -21893,14 +21649,7 @@
                 <w:sz w:val="19"/>
                 <w:szCs w:val="19"/>
               </w:rPr>
-              <w:t>New rate − pr</w:t>
-            </w:r>
-            <w:r>
-              <w:rPr>
-                <w:sz w:val="19"/>
-                <w:szCs w:val="19"/>
-              </w:rPr>
-              <w:t>evious rate (and %); "Monthly → Daily" when the basis changed; "first" for the first version.</w:t>
+              <w:t>New rate − previous rate (and %); "Monthly → Daily" when the basis changed; "first" for the first version.</w:t>
             </w:r>
           </w:p>
         </w:tc>
@@ -21922,7 +21671,7 @@
         <w:t xml:space="preserve">Note: </w:t>
       </w:r>
       <w:r>
-        <w:t>A version saved after its effective date whose cut-offs were already paid shows up in Retro Adjustments → Suggestions.</w:t>
+        <w:t>A version saved after its effective date whose cut-offs were already paid shows up in Payroll Adjustments → Suggestions.</w:t>
       </w:r>
     </w:p>
     <w:p>
@@ -21930,7 +21679,7 @@
         <w:pStyle w:val="Heading2"/>
         <w:spacing w:before="240"/>
       </w:pPr>
-      <w:bookmarkStart w:id="28" w:name="_Toc242606797"/>
+      <w:bookmarkStart w:id="28" w:name="_Toc242887534"/>
       <w:r>
         <w:t>7.2 Contributions</w:t>
       </w:r>
@@ -22336,14 +22085,7 @@
                 <w:sz w:val="19"/>
                 <w:szCs w:val="19"/>
               </w:rPr>
-              <w:t xml:space="preserve">SSS: the salary credit of the bracket the monthly compensation falls in. PhilHealth: </w:t>
-            </w:r>
-            <w:r>
-              <w:rPr>
-                <w:sz w:val="19"/>
-                <w:szCs w:val="19"/>
-              </w:rPr>
-              <w:t>the monthly basic salary kept between the table's floor and ceiling. Pag-IBIG: the compensation up to the bracket's maximum.</w:t>
+              <w:t>SSS: the salary credit of the bracket the monthly compensation falls in. PhilHealth: the monthly basic salary kept between the table's floor and ceiling. Pag-IBIG: the compensation up to the bracket's maximum.</w:t>
             </w:r>
           </w:p>
         </w:tc>
@@ -22429,14 +22171,7 @@
                 <w:sz w:val="19"/>
                 <w:szCs w:val="19"/>
               </w:rPr>
-              <w:t>SSS: the bracket's EE and ER amounts. PhilHealth: base × EE rate and base × ER rate</w:t>
-            </w:r>
-            <w:r>
-              <w:rPr>
-                <w:sz w:val="19"/>
-                <w:szCs w:val="19"/>
-              </w:rPr>
-              <w:t xml:space="preserve"> (5% split 2.5% / 2.5%). Pag-IBIG: base × EE rate and base × ER rate.</w:t>
+              <w:t>SSS: the bracket's EE and ER amounts. PhilHealth: base × EE rate and base × ER rate (5% split 2.5% / 2.5%). Pag-IBIG: base × EE rate and base × ER rate.</w:t>
             </w:r>
           </w:p>
         </w:tc>
@@ -22619,7 +22354,7 @@
         <w:pStyle w:val="Heading2"/>
         <w:spacing w:before="240"/>
       </w:pPr>
-      <w:bookmarkStart w:id="29" w:name="_Toc242606798"/>
+      <w:bookmarkStart w:id="29" w:name="_Toc242887535"/>
       <w:r>
         <w:lastRenderedPageBreak/>
         <w:t>7.3 Allowances</w:t>
@@ -23037,7 +22772,7 @@
         <w:pStyle w:val="Heading2"/>
         <w:spacing w:before="240"/>
       </w:pPr>
-      <w:bookmarkStart w:id="30" w:name="_Toc242606799"/>
+      <w:bookmarkStart w:id="30" w:name="_Toc242887536"/>
       <w:r>
         <w:t>7.4 Deductions</w:t>
       </w:r>
@@ -23712,9 +23447,9 @@
         <w:pStyle w:val="Heading2"/>
         <w:spacing w:before="240"/>
       </w:pPr>
-      <w:bookmarkStart w:id="31" w:name="_Toc242606800"/>
+      <w:bookmarkStart w:id="31" w:name="_Toc242887537"/>
       <w:r>
-        <w:t>7.5 Retro Adjustments</w:t>
+        <w:t>7.5 Payroll Adjustments</w:t>
       </w:r>
       <w:bookmarkEnd w:id="31"/>
     </w:p>
@@ -23735,7 +23470,7 @@
         <w:rPr>
           <w:color w:val="333333"/>
         </w:rPr>
-        <w:t>Payroll → Records → Retro Adjustments</w:t>
+        <w:t>Payroll → Records → Payroll Adjustments</w:t>
       </w:r>
       <w:r>
         <w:rPr>
@@ -23946,7 +23681,7 @@
                 <w:sz w:val="19"/>
                 <w:szCs w:val="19"/>
               </w:rPr>
-              <w:t>Retro Salary, Salary Underpayment (earnings), Salary Overpayment (deduction), Other Adjustment (overtime / allowance underpayment, refund of over-deduction, allowance overpayment, others).</w:t>
+              <w:t>Retro Salary, Salary Underpayment (earnings), Salary Overpayment (deduction), Other Adjustment (Holiday Pay (manual) for a holiday the employee's branch doesn't observe, overtime / allowance underpayment, refund of over-deduction, allowance overpayment, others).</w:t>
             </w:r>
           </w:p>
         </w:tc>
@@ -24325,7 +24060,7 @@
                 <w:szCs w:val="19"/>
               </w:rPr>
               <w:lastRenderedPageBreak/>
-              <w:t>Suggestions: Retro</w:t>
+              <w:t>Suggestions: Retro Salary</w:t>
             </w:r>
           </w:p>
         </w:tc>
@@ -24388,7 +24123,7 @@
         <w:pStyle w:val="Heading2"/>
         <w:spacing w:before="240"/>
       </w:pPr>
-      <w:bookmarkStart w:id="32" w:name="_Toc242606801"/>
+      <w:bookmarkStart w:id="32" w:name="_Toc242887538"/>
       <w:r>
         <w:t>7.6 Bank Accounts</w:t>
       </w:r>
@@ -24476,17 +24211,7 @@
                 <w:sz w:val="19"/>
                 <w:szCs w:val="19"/>
               </w:rPr>
-              <w:t>Colu</w:t>
-            </w:r>
-            <w:r>
-              <w:rPr>
-                <w:b/>
-                <w:bCs/>
-                <w:color w:val="FFFFFF"/>
-                <w:sz w:val="19"/>
-                <w:szCs w:val="19"/>
-              </w:rPr>
-              <w:t>mn</w:t>
+              <w:t>Column</w:t>
             </w:r>
           </w:p>
         </w:tc>
@@ -24819,7 +24544,7 @@
       <w:pPr>
         <w:pStyle w:val="Heading1"/>
       </w:pPr>
-      <w:bookmarkStart w:id="33" w:name="_Toc242606802"/>
+      <w:bookmarkStart w:id="33" w:name="_Toc242887539"/>
       <w:r>
         <w:lastRenderedPageBreak/>
         <w:t>8. Payroll → Setup</w:t>
@@ -24831,7 +24556,7 @@
         <w:pStyle w:val="Heading2"/>
         <w:spacing w:before="240"/>
       </w:pPr>
-      <w:bookmarkStart w:id="34" w:name="_Toc242606803"/>
+      <w:bookmarkStart w:id="34" w:name="_Toc242887540"/>
       <w:r>
         <w:t>8.1 Payroll Settings — Premium Rates</w:t>
       </w:r>
@@ -26714,7 +26439,7 @@
         <w:pStyle w:val="Heading2"/>
         <w:spacing w:before="240"/>
       </w:pPr>
-      <w:bookmarkStart w:id="35" w:name="_Toc242606804"/>
+      <w:bookmarkStart w:id="35" w:name="_Toc242887541"/>
       <w:r>
         <w:t>8.2 Contribution Tables, Allowance / Deduction Types, Banks, Leave Types</w:t>
       </w:r>
@@ -26948,14 +26673,7 @@
                 <w:sz w:val="19"/>
                 <w:szCs w:val="19"/>
               </w:rPr>
-              <w:t>The vers</w:t>
-            </w:r>
-            <w:r>
-              <w:rPr>
-                <w:sz w:val="19"/>
-                <w:szCs w:val="19"/>
-              </w:rPr>
-              <w:t>ion in force on a date is the latest effective date on or before it (SSS 2025, PhilHealth 2024, Pag-IBIG Feb 2024, BIR 2023 loaded — verify).</w:t>
+              <w:t>The version in force on a date is the latest effective date on or before it (SSS 2025, PhilHealth 2024, Pag-IBIG Feb 2024, BIR 2023 loaded — verify).</w:t>
             </w:r>
           </w:p>
         </w:tc>
@@ -27128,14 +26846,7 @@
                 <w:sz w:val="19"/>
                 <w:szCs w:val="19"/>
               </w:rPr>
-              <w:t xml:space="preserve">De </w:t>
-            </w:r>
-            <w:r>
-              <w:rPr>
-                <w:sz w:val="19"/>
-                <w:szCs w:val="19"/>
-              </w:rPr>
-              <w:t>minimis: non-taxable up to its limit per month; the excess is taxable.</w:t>
+              <w:t>De minimis: non-taxable up to its limit per month; the excess is taxable.</w:t>
             </w:r>
           </w:p>
         </w:tc>
@@ -27494,7 +27205,7 @@
       <w:pPr>
         <w:pStyle w:val="Heading1"/>
       </w:pPr>
-      <w:bookmarkStart w:id="36" w:name="_Toc242606805"/>
+      <w:bookmarkStart w:id="36" w:name="_Toc242887542"/>
       <w:r>
         <w:lastRenderedPageBreak/>
         <w:t>9. My Workspace (employee self-service)</w:t>
@@ -27506,12 +27217,9 @@
         <w:pStyle w:val="Heading2"/>
         <w:spacing w:before="240"/>
       </w:pPr>
-      <w:bookmarkStart w:id="37" w:name="_Toc242606806"/>
+      <w:bookmarkStart w:id="37" w:name="_Toc242887543"/>
       <w:r>
-        <w:t>9.1 My Payslips and My Attendanc</w:t>
-      </w:r>
-      <w:r>
-        <w:t>e</w:t>
+        <w:t>9.1 My Payslips and My Attendance</w:t>
       </w:r>
       <w:bookmarkEnd w:id="37"/>
     </w:p>

</xml_diff>